<commit_message>
Casos de uso revisados, adicionando e excluindo fluxos necessários para o casamento com o resto do projeto. Close #20
</commit_message>
<xml_diff>
--- a/Requisitos/CSU08 - Consultar Restaurante.docx
+++ b/Requisitos/CSU08 - Consultar Restaurante.docx
@@ -1,6 +1,6 @@
 
 <file path=word/document.xml><?xml version="1.0" encoding="utf-8"?>
-<w:document xmlns:wpc="http://schemas.microsoft.com/office/word/2010/wordprocessingCanvas" xmlns:cx="http://schemas.microsoft.com/office/drawing/2014/chartex" xmlns:cx1="http://schemas.microsoft.com/office/drawing/2015/9/8/chartex" xmlns:cx2="http://schemas.microsoft.com/office/drawing/2015/10/21/chartex" xmlns:cx3="http://schemas.microsoft.com/office/drawing/2016/5/9/chartex" xmlns:cx4="http://schemas.microsoft.com/office/drawing/2016/5/10/chartex" xmlns:cx5="http://schemas.microsoft.com/office/drawing/2016/5/11/chartex" xmlns:cx6="http://schemas.microsoft.com/office/drawing/2016/5/12/chartex" xmlns:cx7="http://schemas.microsoft.com/office/drawing/2016/5/13/chartex" xmlns:cx8="http://schemas.microsoft.com/office/drawing/2016/5/14/chartex" xmlns:mc="http://schemas.openxmlformats.org/markup-compatibility/2006" xmlns:aink="http://schemas.microsoft.com/office/drawing/2016/ink" xmlns:am3d="http://schemas.microsoft.com/office/drawing/2017/model3d" xmlns:o="urn:schemas-microsoft-com:office:office" xmlns:r="http://schemas.openxmlformats.org/officeDocument/2006/relationships" xmlns:m="http://schemas.openxmlformats.org/officeDocument/2006/math" xmlns:v="urn:schemas-microsoft-com:vml" xmlns:wp14="http://schemas.microsoft.com/office/word/2010/wordprocessingDrawing" xmlns:wp="http://schemas.openxmlformats.org/drawingml/2006/wordprocessingDrawing" xmlns:w10="urn:schemas-microsoft-com:office:word" xmlns:w="http://schemas.openxmlformats.org/wordprocessingml/2006/main" xmlns:w14="http://schemas.microsoft.com/office/word/2010/wordml" xmlns:w15="http://schemas.microsoft.com/office/word/2012/wordml" xmlns:w16cex="http://schemas.microsoft.com/office/word/2018/wordml/cex" xmlns:w16cid="http://schemas.microsoft.com/office/word/2016/wordml/cid" xmlns:w16="http://schemas.microsoft.com/office/word/2018/wordml" xmlns:w16se="http://schemas.microsoft.com/office/word/2015/wordml/symex" xmlns:wpg="http://schemas.microsoft.com/office/word/2010/wordprocessingGroup" xmlns:wpi="http://schemas.microsoft.com/office/word/2010/wordprocessingInk" xmlns:wne="http://schemas.microsoft.com/office/word/2006/wordml" xmlns:wps="http://schemas.microsoft.com/office/word/2010/wordprocessingShape" mc:Ignorable="w14 w15 w16se w16cid w16 w16cex wp14">
+<w:document xmlns:wpc="http://schemas.microsoft.com/office/word/2010/wordprocessingCanvas" xmlns:cx="http://schemas.microsoft.com/office/drawing/2014/chartex" xmlns:cx1="http://schemas.microsoft.com/office/drawing/2015/9/8/chartex" xmlns:cx2="http://schemas.microsoft.com/office/drawing/2015/10/21/chartex" xmlns:cx3="http://schemas.microsoft.com/office/drawing/2016/5/9/chartex" xmlns:cx4="http://schemas.microsoft.com/office/drawing/2016/5/10/chartex" xmlns:cx5="http://schemas.microsoft.com/office/drawing/2016/5/11/chartex" xmlns:cx6="http://schemas.microsoft.com/office/drawing/2016/5/12/chartex" xmlns:cx7="http://schemas.microsoft.com/office/drawing/2016/5/13/chartex" xmlns:cx8="http://schemas.microsoft.com/office/drawing/2016/5/14/chartex" xmlns:mc="http://schemas.openxmlformats.org/markup-compatibility/2006" xmlns:aink="http://schemas.microsoft.com/office/drawing/2016/ink" xmlns:am3d="http://schemas.microsoft.com/office/drawing/2017/model3d" xmlns:o="urn:schemas-microsoft-com:office:office" xmlns:oel="http://schemas.microsoft.com/office/2019/extlst" xmlns:r="http://schemas.openxmlformats.org/officeDocument/2006/relationships" xmlns:m="http://schemas.openxmlformats.org/officeDocument/2006/math" xmlns:v="urn:schemas-microsoft-com:vml" xmlns:wp14="http://schemas.microsoft.com/office/word/2010/wordprocessingDrawing" xmlns:wp="http://schemas.openxmlformats.org/drawingml/2006/wordprocessingDrawing" xmlns:w10="urn:schemas-microsoft-com:office:word" xmlns:w="http://schemas.openxmlformats.org/wordprocessingml/2006/main" xmlns:w14="http://schemas.microsoft.com/office/word/2010/wordml" xmlns:w15="http://schemas.microsoft.com/office/word/2012/wordml" xmlns:w16cex="http://schemas.microsoft.com/office/word/2018/wordml/cex" xmlns:w16cid="http://schemas.microsoft.com/office/word/2016/wordml/cid" xmlns:w16="http://schemas.microsoft.com/office/word/2018/wordml" xmlns:w16du="http://schemas.microsoft.com/office/word/2023/wordml/word16du" xmlns:w16sdtdh="http://schemas.microsoft.com/office/word/2020/wordml/sdtdatahash" xmlns:w16sdtfl="http://schemas.microsoft.com/office/word/2024/wordml/sdtformatlock" xmlns:w16se="http://schemas.microsoft.com/office/word/2015/wordml/symex" xmlns:wpg="http://schemas.microsoft.com/office/word/2010/wordprocessingGroup" xmlns:wpi="http://schemas.microsoft.com/office/word/2010/wordprocessingInk" xmlns:wne="http://schemas.microsoft.com/office/word/2006/wordml" xmlns:wps="http://schemas.microsoft.com/office/word/2010/wordprocessingShape" mc:Ignorable="w14 w15 w16se w16cid w16 w16cex w16sdtdh w16sdtfl w16du wp14">
   <w:body>
     <w:p>
       <w:pPr>
@@ -18,25 +18,7 @@
           <w:sz w:val="36"/>
           <w:szCs w:val="36"/>
         </w:rPr>
-        <w:t>CSU</w:t>
-      </w:r>
-      <w:r>
-        <w:rPr>
-          <w:b/>
-          <w:color w:val="FF0000"/>
-          <w:sz w:val="36"/>
-          <w:szCs w:val="36"/>
-        </w:rPr>
-        <w:t>08</w:t>
-      </w:r>
-      <w:r>
-        <w:rPr>
-          <w:b/>
-          <w:color w:val="FF0000"/>
-          <w:sz w:val="36"/>
-          <w:szCs w:val="36"/>
-        </w:rPr>
-        <w:t xml:space="preserve">: </w:t>
+        <w:t xml:space="preserve">CSU08: </w:t>
       </w:r>
       <w:r>
         <w:rPr>
@@ -44,7 +26,15 @@
           <w:sz w:val="36"/>
           <w:szCs w:val="36"/>
         </w:rPr>
-        <w:t xml:space="preserve">Consultar Restaurante </w:t>
+        <w:t>Manter</w:t>
+      </w:r>
+      <w:r>
+        <w:rPr>
+          <w:b/>
+          <w:sz w:val="36"/>
+          <w:szCs w:val="36"/>
+        </w:rPr>
+        <w:t xml:space="preserve"> Restaurante </w:t>
       </w:r>
     </w:p>
     <w:p>
@@ -96,7 +86,6 @@
               <w:bottom w:val="single" w:sz="4" w:space="0" w:color="000000"/>
               <w:right w:val="single" w:sz="4" w:space="0" w:color="000000"/>
             </w:tcBorders>
-            <w:shd w:val="clear" w:color="auto" w:fill="auto"/>
           </w:tcPr>
           <w:p>
             <w:r>
@@ -118,7 +107,6 @@
               <w:bottom w:val="single" w:sz="4" w:space="0" w:color="000000"/>
               <w:right w:val="single" w:sz="4" w:space="0" w:color="000000"/>
             </w:tcBorders>
-            <w:shd w:val="clear" w:color="auto" w:fill="auto"/>
           </w:tcPr>
           <w:p>
             <w:pPr>
@@ -132,22 +120,10 @@
               <w:rPr>
                 <w:b w:val="0"/>
               </w:rPr>
-              <w:t>70</w:t>
-            </w:r>
-            <w:r>
-              <w:rPr>
-                <w:b w:val="0"/>
-              </w:rPr>
-              <w:t>(</w:t>
-            </w:r>
-            <w:r>
-              <w:t xml:space="preserve">Risco Baixo e Prioridade </w:t>
-            </w:r>
-            <w:r>
-              <w:t>Alta</w:t>
-            </w:r>
-            <w:r>
-              <w:t>)</w:t>
+              <w:t>70(</w:t>
+            </w:r>
+            <w:r>
+              <w:t>Risco Baixo e Prioridade Alta)</w:t>
             </w:r>
           </w:p>
         </w:tc>
@@ -162,7 +138,6 @@
               <w:bottom w:val="single" w:sz="4" w:space="0" w:color="000000"/>
               <w:right w:val="single" w:sz="4" w:space="0" w:color="000000"/>
             </w:tcBorders>
-            <w:shd w:val="clear" w:color="auto" w:fill="auto"/>
           </w:tcPr>
           <w:p>
             <w:r>
@@ -184,22 +159,35 @@
               <w:bottom w:val="single" w:sz="4" w:space="0" w:color="000000"/>
               <w:right w:val="single" w:sz="4" w:space="0" w:color="000000"/>
             </w:tcBorders>
-            <w:shd w:val="clear" w:color="auto" w:fill="auto"/>
-          </w:tcPr>
-          <w:p>
-            <w:r>
-              <w:rPr>
-                <w:sz w:val="28"/>
-                <w:szCs w:val="28"/>
-              </w:rPr>
-              <w:t xml:space="preserve">O </w:t>
-            </w:r>
-            <w:r>
-              <w:rPr>
-                <w:sz w:val="28"/>
-                <w:szCs w:val="28"/>
-              </w:rPr>
-              <w:t>Administrador pode consultar restaurantes cadastrados no sistema</w:t>
+          </w:tcPr>
+          <w:p>
+            <w:r>
+              <w:rPr>
+                <w:sz w:val="28"/>
+                <w:szCs w:val="28"/>
+              </w:rPr>
+              <w:t xml:space="preserve">O Administrador pode </w:t>
+            </w:r>
+            <w:r>
+              <w:rPr>
+                <w:sz w:val="28"/>
+                <w:szCs w:val="28"/>
+              </w:rPr>
+              <w:t xml:space="preserve">adicionar, remover e </w:t>
+            </w:r>
+            <w:r>
+              <w:rPr>
+                <w:sz w:val="28"/>
+                <w:szCs w:val="28"/>
+              </w:rPr>
+              <w:t>consultar restaurantes</w:t>
+            </w:r>
+            <w:r>
+              <w:rPr>
+                <w:sz w:val="28"/>
+                <w:szCs w:val="28"/>
+              </w:rPr>
+              <w:t>.</w:t>
             </w:r>
           </w:p>
         </w:tc>
@@ -214,7 +202,6 @@
               <w:bottom w:val="single" w:sz="4" w:space="0" w:color="000000"/>
               <w:right w:val="single" w:sz="4" w:space="0" w:color="000000"/>
             </w:tcBorders>
-            <w:shd w:val="clear" w:color="auto" w:fill="auto"/>
           </w:tcPr>
           <w:p>
             <w:r>
@@ -236,7 +223,6 @@
               <w:bottom w:val="single" w:sz="4" w:space="0" w:color="000000"/>
               <w:right w:val="single" w:sz="4" w:space="0" w:color="000000"/>
             </w:tcBorders>
-            <w:shd w:val="clear" w:color="auto" w:fill="auto"/>
           </w:tcPr>
           <w:p>
             <w:r>
@@ -259,7 +245,6 @@
               <w:bottom w:val="single" w:sz="4" w:space="0" w:color="000000"/>
               <w:right w:val="single" w:sz="4" w:space="0" w:color="000000"/>
             </w:tcBorders>
-            <w:shd w:val="clear" w:color="auto" w:fill="auto"/>
           </w:tcPr>
           <w:p>
             <w:r>
@@ -281,7 +266,6 @@
               <w:bottom w:val="single" w:sz="4" w:space="0" w:color="000000"/>
               <w:right w:val="single" w:sz="4" w:space="0" w:color="000000"/>
             </w:tcBorders>
-            <w:shd w:val="clear" w:color="auto" w:fill="auto"/>
           </w:tcPr>
           <w:p>
             <w:r>
@@ -307,7 +291,6 @@
               <w:bottom w:val="single" w:sz="4" w:space="0" w:color="000000"/>
               <w:right w:val="single" w:sz="4" w:space="0" w:color="000000"/>
             </w:tcBorders>
-            <w:shd w:val="clear" w:color="auto" w:fill="auto"/>
           </w:tcPr>
           <w:p>
             <w:r>
@@ -329,7 +312,6 @@
               <w:bottom w:val="single" w:sz="4" w:space="0" w:color="000000"/>
               <w:right w:val="single" w:sz="4" w:space="0" w:color="000000"/>
             </w:tcBorders>
-            <w:shd w:val="clear" w:color="auto" w:fill="auto"/>
           </w:tcPr>
           <w:p>
             <w:r>
@@ -377,47 +359,7 @@
                 <w:szCs w:val="28"/>
               </w:rPr>
               <w:br/>
-              <w:t>CSU0</w:t>
-            </w:r>
-            <w:r>
-              <w:rPr>
-                <w:color w:val="FF0000"/>
-                <w:sz w:val="28"/>
-                <w:szCs w:val="28"/>
-              </w:rPr>
-              <w:t>2</w:t>
-            </w:r>
-            <w:r>
-              <w:rPr>
-                <w:color w:val="FF0000"/>
-                <w:sz w:val="28"/>
-                <w:szCs w:val="28"/>
-              </w:rPr>
-              <w:t>-</w:t>
-            </w:r>
-            <w:r>
-              <w:rPr>
-                <w:color w:val="FF0000"/>
-                <w:sz w:val="28"/>
-                <w:szCs w:val="28"/>
-              </w:rPr>
-              <w:t>Autenticar</w:t>
-            </w:r>
-            <w:r>
-              <w:rPr>
-                <w:color w:val="FF0000"/>
-                <w:sz w:val="28"/>
-                <w:szCs w:val="28"/>
-              </w:rPr>
-              <w:t xml:space="preserve"> </w:t>
-            </w:r>
-            <w:r>
-              <w:rPr>
-                <w:color w:val="FF0000"/>
-                <w:sz w:val="28"/>
-                <w:szCs w:val="28"/>
-              </w:rPr>
-              <w:t>Usuário</w:t>
+              <w:t>CSU02-Autenticar Usuário</w:t>
             </w:r>
             <w:r>
               <w:rPr>
@@ -439,7 +381,6 @@
               <w:bottom w:val="single" w:sz="4" w:space="0" w:color="000000"/>
               <w:right w:val="single" w:sz="4" w:space="0" w:color="000000"/>
             </w:tcBorders>
-            <w:shd w:val="clear" w:color="auto" w:fill="auto"/>
           </w:tcPr>
           <w:p>
             <w:r>
@@ -461,7 +402,6 @@
               <w:bottom w:val="single" w:sz="4" w:space="0" w:color="000000"/>
               <w:right w:val="single" w:sz="4" w:space="0" w:color="000000"/>
             </w:tcBorders>
-            <w:shd w:val="clear" w:color="auto" w:fill="auto"/>
           </w:tcPr>
           <w:p>
             <w:r>
@@ -489,7 +429,6 @@
               <w:bottom w:val="single" w:sz="4" w:space="0" w:color="000000"/>
               <w:right w:val="single" w:sz="4" w:space="0" w:color="000000"/>
             </w:tcBorders>
-            <w:shd w:val="clear" w:color="auto" w:fill="auto"/>
           </w:tcPr>
           <w:p>
             <w:pPr>
@@ -522,7 +461,6 @@
               <w:bottom w:val="single" w:sz="4" w:space="0" w:color="000000"/>
               <w:right w:val="single" w:sz="4" w:space="0" w:color="000000"/>
             </w:tcBorders>
-            <w:shd w:val="clear" w:color="auto" w:fill="auto"/>
           </w:tcPr>
           <w:p>
             <w:pPr>
@@ -543,7 +481,21 @@
                 <w:sz w:val="28"/>
                 <w:szCs w:val="28"/>
               </w:rPr>
-              <w:t>1. Ator clica no botão “Restaurantes” na tela inicial do sistema (</w:t>
+              <w:t xml:space="preserve">1. </w:t>
+            </w:r>
+            <w:r>
+              <w:rPr>
+                <w:sz w:val="28"/>
+                <w:szCs w:val="28"/>
+              </w:rPr>
+              <w:t>Sistema exibe a tela inicial do administrador</w:t>
+            </w:r>
+            <w:r>
+              <w:rPr>
+                <w:sz w:val="28"/>
+                <w:szCs w:val="28"/>
+              </w:rPr>
+              <w:t xml:space="preserve"> (</w:t>
             </w:r>
             <w:r>
               <w:rPr>
@@ -558,117 +510,67 @@
                 <w:sz w:val="28"/>
                 <w:szCs w:val="28"/>
               </w:rPr>
-              <w:t>).</w:t>
-            </w:r>
-          </w:p>
-          <w:p>
-            <w:pPr>
-              <w:pBdr>
-                <w:top w:val="nil"/>
-                <w:left w:val="nil"/>
-                <w:bottom w:val="nil"/>
-                <w:right w:val="nil"/>
-                <w:between w:val="nil"/>
-              </w:pBdr>
-              <w:rPr>
-                <w:sz w:val="28"/>
-                <w:szCs w:val="28"/>
-              </w:rPr>
-            </w:pPr>
-            <w:r>
-              <w:rPr>
-                <w:sz w:val="28"/>
-                <w:szCs w:val="28"/>
-              </w:rPr>
-              <w:t>2. Sistema exibe tela listando todos os restaurantes cadastrados no sistema (</w:t>
-            </w:r>
-            <w:r>
+              <w:t>)</w:t>
+            </w:r>
+            <w:r>
+              <w:rPr>
+                <w:sz w:val="28"/>
+                <w:szCs w:val="28"/>
+              </w:rPr>
+              <w:t xml:space="preserve"> com 2 opções:</w:t>
+            </w:r>
+          </w:p>
+          <w:p>
+            <w:pPr>
+              <w:ind w:left="-170" w:right="57"/>
+              <w:rPr>
+                <w:color w:val="000000"/>
+                <w:sz w:val="28"/>
+                <w:szCs w:val="28"/>
+              </w:rPr>
+            </w:pPr>
+            <w:r>
+              <w:rPr>
+                <w:sz w:val="28"/>
+                <w:szCs w:val="28"/>
+              </w:rPr>
+              <w:t xml:space="preserve">      </w:t>
+            </w:r>
+            <w:r>
+              <w:rPr>
+                <w:sz w:val="28"/>
+                <w:szCs w:val="28"/>
+              </w:rPr>
+              <w:t>Caso a opção seja:</w:t>
+            </w:r>
+          </w:p>
+          <w:p>
+            <w:pPr>
+              <w:pStyle w:val="PargrafodaLista"/>
+              <w:numPr>
+                <w:ilvl w:val="0"/>
+                <w:numId w:val="4"/>
+              </w:numPr>
               <w:rPr>
                 <w:color w:val="FF0000"/>
                 <w:sz w:val="28"/>
                 <w:szCs w:val="28"/>
               </w:rPr>
-              <w:t>Tela_W18</w:t>
-            </w:r>
-            <w:r>
-              <w:rPr>
-                <w:sz w:val="28"/>
-                <w:szCs w:val="28"/>
-              </w:rPr>
-              <w:t>).</w:t>
-            </w:r>
-          </w:p>
-          <w:p>
-            <w:pPr>
-              <w:pBdr>
-                <w:top w:val="nil"/>
-                <w:left w:val="nil"/>
-                <w:bottom w:val="nil"/>
-                <w:right w:val="nil"/>
-                <w:between w:val="nil"/>
-              </w:pBdr>
-              <w:rPr>
-                <w:sz w:val="28"/>
-                <w:szCs w:val="28"/>
-              </w:rPr>
-            </w:pPr>
-            <w:r>
-              <w:rPr>
-                <w:sz w:val="28"/>
-                <w:szCs w:val="28"/>
-              </w:rPr>
-              <w:t>3. Ator procura o restaurante que deseja para ser consultado na lista ou digita o seu nome no campo “Pesquisar Restaurante”.</w:t>
-            </w:r>
-          </w:p>
-          <w:p>
-            <w:pPr>
-              <w:pBdr>
-                <w:top w:val="nil"/>
-                <w:left w:val="nil"/>
-                <w:bottom w:val="nil"/>
-                <w:right w:val="nil"/>
-                <w:between w:val="nil"/>
-              </w:pBdr>
-              <w:rPr>
-                <w:sz w:val="28"/>
-                <w:szCs w:val="28"/>
-              </w:rPr>
-            </w:pPr>
-            <w:r>
-              <w:rPr>
-                <w:sz w:val="28"/>
-                <w:szCs w:val="28"/>
-              </w:rPr>
-              <w:t xml:space="preserve">4. Ator seleciona o restaurante desejado e </w:t>
-            </w:r>
-            <w:r>
-              <w:rPr>
-                <w:sz w:val="28"/>
-                <w:szCs w:val="28"/>
-              </w:rPr>
-              <w:t>clica no botão “Visualizar” para consultar dados do estabelecimento.</w:t>
-            </w:r>
-          </w:p>
-          <w:p>
-            <w:pPr>
-              <w:pBdr>
-                <w:top w:val="nil"/>
-                <w:left w:val="nil"/>
-                <w:bottom w:val="nil"/>
-                <w:right w:val="nil"/>
-                <w:between w:val="nil"/>
-              </w:pBdr>
-              <w:rPr>
-                <w:sz w:val="28"/>
-                <w:szCs w:val="28"/>
-              </w:rPr>
-            </w:pPr>
-            <w:r>
-              <w:rPr>
-                <w:sz w:val="28"/>
-                <w:szCs w:val="28"/>
-              </w:rPr>
-              <w:t>5. Sistema exibe tela “Visualizar Restaurante Cadastrado” (</w:t>
+            </w:pPr>
+            <w:r>
+              <w:rPr>
+                <w:sz w:val="28"/>
+                <w:szCs w:val="28"/>
+              </w:rPr>
+              <w:t>Restaurantes</w:t>
+            </w:r>
+            <w:r>
+              <w:rPr>
+                <w:color w:val="000000"/>
+                <w:sz w:val="28"/>
+                <w:szCs w:val="28"/>
+              </w:rPr>
+              <w:t>:</w:t>
             </w:r>
             <w:r>
               <w:rPr>
@@ -676,21 +578,222 @@
                 <w:sz w:val="28"/>
                 <w:szCs w:val="28"/>
               </w:rPr>
-              <w:t>Tela_W21</w:t>
-            </w:r>
-            <w:r>
-              <w:rPr>
-                <w:sz w:val="28"/>
-                <w:szCs w:val="28"/>
-              </w:rPr>
-              <w:t>).</w:t>
+              <w:t xml:space="preserve"> </w:t>
+            </w:r>
+            <w:r>
+              <w:rPr>
+                <w:color w:val="000000"/>
+                <w:sz w:val="28"/>
+                <w:szCs w:val="28"/>
+              </w:rPr>
+              <w:t>Ver</w:t>
+            </w:r>
+            <w:r>
+              <w:rPr>
+                <w:color w:val="FF0000"/>
+                <w:sz w:val="28"/>
+                <w:szCs w:val="28"/>
+              </w:rPr>
+              <w:t xml:space="preserve"> </w:t>
+            </w:r>
+            <w:r>
+              <w:rPr>
+                <w:color w:val="FF0000"/>
+                <w:sz w:val="28"/>
+                <w:szCs w:val="28"/>
+              </w:rPr>
+              <w:t>Consultar Restaurante</w:t>
+            </w:r>
+          </w:p>
+          <w:p>
+            <w:pPr>
+              <w:pStyle w:val="PargrafodaLista"/>
+              <w:numPr>
+                <w:ilvl w:val="0"/>
+                <w:numId w:val="4"/>
+              </w:numPr>
+              <w:rPr>
+                <w:sz w:val="28"/>
+                <w:szCs w:val="28"/>
+              </w:rPr>
+            </w:pPr>
+            <w:r>
+              <w:rPr>
+                <w:sz w:val="28"/>
+                <w:szCs w:val="28"/>
+              </w:rPr>
+              <w:t xml:space="preserve">Restaurantes: Ver </w:t>
+            </w:r>
+            <w:r>
+              <w:rPr>
+                <w:color w:val="EE0000"/>
+                <w:sz w:val="28"/>
+                <w:szCs w:val="28"/>
+              </w:rPr>
+              <w:t xml:space="preserve">Excluir Restaurante </w:t>
+            </w:r>
+          </w:p>
+          <w:p>
+            <w:pPr>
+              <w:ind w:left="360"/>
+              <w:rPr>
+                <w:color w:val="000000"/>
+                <w:sz w:val="28"/>
+                <w:szCs w:val="28"/>
+              </w:rPr>
+            </w:pPr>
+            <w:r>
+              <w:rPr>
+                <w:sz w:val="28"/>
+                <w:szCs w:val="28"/>
+              </w:rPr>
+              <w:t>c</w:t>
+            </w:r>
+            <w:r>
+              <w:rPr>
+                <w:sz w:val="28"/>
+                <w:szCs w:val="28"/>
+              </w:rPr>
+              <w:t xml:space="preserve">) </w:t>
+            </w:r>
+            <w:r>
+              <w:rPr>
+                <w:sz w:val="28"/>
+                <w:szCs w:val="28"/>
+              </w:rPr>
+              <w:t xml:space="preserve">Cadastrar Restaurante: </w:t>
+            </w:r>
+            <w:r>
+              <w:rPr>
+                <w:sz w:val="28"/>
+                <w:szCs w:val="28"/>
+              </w:rPr>
+              <w:t xml:space="preserve">Ver </w:t>
+            </w:r>
+            <w:r>
+              <w:rPr>
+                <w:color w:val="FF0000"/>
+                <w:sz w:val="28"/>
+                <w:szCs w:val="28"/>
+              </w:rPr>
+              <w:t>Adicionar Restaurante</w:t>
+            </w:r>
+          </w:p>
+          <w:p>
+            <w:pPr>
+              <w:ind w:left="360"/>
+              <w:rPr>
+                <w:sz w:val="28"/>
+                <w:szCs w:val="28"/>
+              </w:rPr>
+            </w:pPr>
+          </w:p>
+        </w:tc>
+      </w:tr>
+    </w:tbl>
+    <w:p>
+      <w:pPr>
+        <w:jc w:val="center"/>
+      </w:pPr>
+      <w:bookmarkStart w:id="0" w:name="_heading=h.5pvsygsayg8" w:colFirst="0" w:colLast="0"/>
+      <w:bookmarkEnd w:id="0"/>
+    </w:p>
+    <w:p>
+      <w:pPr>
+        <w:pStyle w:val="Ttulo1"/>
+        <w:numPr>
+          <w:ilvl w:val="0"/>
+          <w:numId w:val="2"/>
+        </w:numPr>
+      </w:pPr>
+      <w:r>
+        <w:t xml:space="preserve">Seção: </w:t>
+      </w:r>
+      <w:r>
+        <w:rPr>
+          <w:b w:val="0"/>
+        </w:rPr>
+        <w:t>Consultar Restaurante</w:t>
+      </w:r>
+    </w:p>
+    <w:tbl>
+      <w:tblPr>
+        <w:tblW w:w="10330" w:type="dxa"/>
+        <w:tblInd w:w="-70" w:type="dxa"/>
+        <w:tblLayout w:type="fixed"/>
+        <w:tblLook w:val="0000" w:firstRow="0" w:lastRow="0" w:firstColumn="0" w:lastColumn="0" w:noHBand="0" w:noVBand="0"/>
+      </w:tblPr>
+      <w:tblGrid>
+        <w:gridCol w:w="2905"/>
+        <w:gridCol w:w="7425"/>
+      </w:tblGrid>
+      <w:tr>
+        <w:tc>
+          <w:tcPr>
+            <w:tcW w:w="2905" w:type="dxa"/>
+            <w:tcBorders>
+              <w:top w:val="single" w:sz="4" w:space="0" w:color="000000"/>
+              <w:left w:val="single" w:sz="4" w:space="0" w:color="000000"/>
+              <w:bottom w:val="single" w:sz="4" w:space="0" w:color="000000"/>
+              <w:right w:val="single" w:sz="4" w:space="0" w:color="000000"/>
+            </w:tcBorders>
+          </w:tcPr>
+          <w:p>
+            <w:r>
+              <w:rPr>
+                <w:b/>
+                <w:sz w:val="28"/>
+                <w:szCs w:val="28"/>
+              </w:rPr>
+              <w:t>Sumário</w:t>
+            </w:r>
+          </w:p>
+        </w:tc>
+        <w:tc>
+          <w:tcPr>
+            <w:tcW w:w="7425" w:type="dxa"/>
+            <w:tcBorders>
+              <w:top w:val="single" w:sz="4" w:space="0" w:color="000000"/>
+              <w:left w:val="single" w:sz="4" w:space="0" w:color="000000"/>
+              <w:bottom w:val="single" w:sz="4" w:space="0" w:color="000000"/>
+              <w:right w:val="single" w:sz="4" w:space="0" w:color="000000"/>
+            </w:tcBorders>
+          </w:tcPr>
+          <w:p>
+            <w:r>
+              <w:rPr>
+                <w:sz w:val="28"/>
+                <w:szCs w:val="28"/>
+              </w:rPr>
+              <w:t xml:space="preserve">Permite o </w:t>
+            </w:r>
+            <w:r>
+              <w:rPr>
+                <w:sz w:val="28"/>
+                <w:szCs w:val="28"/>
+              </w:rPr>
+              <w:t>administrador</w:t>
+            </w:r>
+            <w:r>
+              <w:rPr>
+                <w:sz w:val="28"/>
+                <w:szCs w:val="28"/>
+              </w:rPr>
+              <w:t xml:space="preserve"> consultar </w:t>
+            </w:r>
+            <w:r>
+              <w:rPr>
+                <w:sz w:val="28"/>
+                <w:szCs w:val="28"/>
+              </w:rPr>
+              <w:t>determinado restaurante.</w:t>
             </w:r>
           </w:p>
         </w:tc>
       </w:tr>
       <w:tr>
         <w:trPr>
-          <w:trHeight w:val="415"/>
+          <w:cantSplit/>
         </w:trPr>
         <w:tc>
           <w:tcPr>
@@ -702,40 +805,27 @@
               <w:bottom w:val="single" w:sz="4" w:space="0" w:color="000000"/>
               <w:right w:val="single" w:sz="4" w:space="0" w:color="000000"/>
             </w:tcBorders>
-            <w:shd w:val="clear" w:color="auto" w:fill="auto"/>
-          </w:tcPr>
-          <w:p>
-            <w:pPr>
-              <w:pBdr>
-                <w:top w:val="nil"/>
-                <w:left w:val="nil"/>
-                <w:bottom w:val="nil"/>
-                <w:right w:val="nil"/>
-                <w:between w:val="nil"/>
-              </w:pBdr>
-              <w:jc w:val="center"/>
+          </w:tcPr>
+          <w:p>
+            <w:pPr>
+              <w:pStyle w:val="Ttulo2"/>
+              <w:numPr>
+                <w:ilvl w:val="1"/>
+                <w:numId w:val="2"/>
+              </w:numPr>
+            </w:pPr>
+            <w:r>
               <w:rPr>
                 <w:b/>
-                <w:bCs/>
-                <w:sz w:val="28"/>
-                <w:szCs w:val="28"/>
-              </w:rPr>
-            </w:pPr>
-            <w:r>
-              <w:rPr>
-                <w:b/>
-                <w:bCs/>
-                <w:sz w:val="28"/>
-                <w:szCs w:val="28"/>
-              </w:rPr>
-              <w:t>Fluxo de Exceção</w:t>
+              </w:rPr>
+              <w:t>Fluxo Principal</w:t>
             </w:r>
           </w:p>
         </w:tc>
       </w:tr>
       <w:tr>
         <w:trPr>
-          <w:trHeight w:val="415"/>
+          <w:trHeight w:val="868"/>
         </w:trPr>
         <w:tc>
           <w:tcPr>
@@ -747,67 +837,122 @@
               <w:bottom w:val="single" w:sz="4" w:space="0" w:color="000000"/>
               <w:right w:val="single" w:sz="4" w:space="0" w:color="000000"/>
             </w:tcBorders>
-            <w:shd w:val="clear" w:color="auto" w:fill="auto"/>
-          </w:tcPr>
-          <w:p>
-            <w:pPr>
-              <w:pBdr>
-                <w:top w:val="nil"/>
-                <w:left w:val="nil"/>
-                <w:bottom w:val="nil"/>
-                <w:right w:val="nil"/>
-                <w:between w:val="nil"/>
-              </w:pBdr>
-              <w:jc w:val="both"/>
-              <w:rPr>
-                <w:sz w:val="28"/>
-                <w:szCs w:val="28"/>
-              </w:rPr>
-            </w:pPr>
-            <w:r>
-              <w:rPr>
-                <w:b/>
+          </w:tcPr>
+          <w:p>
+            <w:pPr>
+              <w:pStyle w:val="Ttulo1"/>
+              <w:numPr>
+                <w:ilvl w:val="0"/>
+                <w:numId w:val="7"/>
+              </w:numPr>
+              <w:rPr>
+                <w:b w:val="0"/>
                 <w:bCs/>
-                <w:sz w:val="28"/>
-                <w:szCs w:val="28"/>
-              </w:rPr>
-              <w:t xml:space="preserve">Linha 3: </w:t>
-            </w:r>
-            <w:r>
-              <w:rPr>
-                <w:sz w:val="28"/>
-                <w:szCs w:val="28"/>
-              </w:rPr>
-              <w:t xml:space="preserve">Restaurante não se encontra em meio persistente, exibindo a mensagem “Restaurante não encontrado!”, retornando para tela que lista todos os restaurantes cadastrados no sistema </w:t>
-            </w:r>
-            <w:r>
-              <w:rPr>
-                <w:sz w:val="28"/>
-                <w:szCs w:val="28"/>
-              </w:rPr>
-              <w:t>(</w:t>
-            </w:r>
-            <w:r>
-              <w:rPr>
-                <w:color w:val="FF0000"/>
-                <w:sz w:val="28"/>
-                <w:szCs w:val="28"/>
+              </w:rPr>
+            </w:pPr>
+            <w:r>
+              <w:rPr>
+                <w:b w:val="0"/>
+                <w:bCs/>
+              </w:rPr>
+              <w:t>Sistema exibe tela listando todos os restaurantes cadastrados no sistema (</w:t>
+            </w:r>
+            <w:r>
+              <w:rPr>
+                <w:b w:val="0"/>
+                <w:bCs/>
+                <w:color w:val="EE0000"/>
               </w:rPr>
               <w:t>Tela_W18</w:t>
             </w:r>
             <w:r>
               <w:rPr>
-                <w:sz w:val="28"/>
-                <w:szCs w:val="28"/>
-              </w:rPr>
-              <w:t>).</w:t>
+                <w:b w:val="0"/>
+                <w:bCs/>
+              </w:rPr>
+              <w:t>);</w:t>
+            </w:r>
+          </w:p>
+          <w:p>
+            <w:pPr>
+              <w:pStyle w:val="Ttulo1"/>
+              <w:numPr>
+                <w:ilvl w:val="0"/>
+                <w:numId w:val="7"/>
+              </w:numPr>
+              <w:rPr>
+                <w:b w:val="0"/>
+                <w:bCs/>
+              </w:rPr>
+            </w:pPr>
+            <w:r>
+              <w:rPr>
+                <w:b w:val="0"/>
+                <w:bCs/>
+              </w:rPr>
+              <w:t>Ator procura o restaurante que deseja para ser consultado na lista ou digita o seu nome no campo “Pesquisar Restaurante”;</w:t>
+            </w:r>
+          </w:p>
+          <w:p>
+            <w:pPr>
+              <w:pStyle w:val="Ttulo1"/>
+              <w:numPr>
+                <w:ilvl w:val="0"/>
+                <w:numId w:val="7"/>
+              </w:numPr>
+              <w:rPr>
+                <w:b w:val="0"/>
+                <w:bCs/>
+              </w:rPr>
+            </w:pPr>
+            <w:r>
+              <w:rPr>
+                <w:b w:val="0"/>
+                <w:bCs/>
+              </w:rPr>
+              <w:t>Ator seleciona o restaurante desejado e clica no botão “Visualizar” para consultar dados do estabelecimento;</w:t>
+            </w:r>
+          </w:p>
+          <w:p>
+            <w:pPr>
+              <w:pStyle w:val="Ttulo1"/>
+              <w:numPr>
+                <w:ilvl w:val="0"/>
+                <w:numId w:val="7"/>
+              </w:numPr>
+              <w:rPr>
+                <w:b w:val="0"/>
+                <w:bCs/>
+              </w:rPr>
+            </w:pPr>
+            <w:r>
+              <w:rPr>
+                <w:b w:val="0"/>
+                <w:bCs/>
+              </w:rPr>
+              <w:t>Sistema exibe tela “Visualizar Restaurante Cadastrado” (</w:t>
+            </w:r>
+            <w:r>
+              <w:rPr>
+                <w:b w:val="0"/>
+                <w:bCs/>
+                <w:color w:val="EE0000"/>
+              </w:rPr>
+              <w:t>Tela_W21</w:t>
+            </w:r>
+            <w:r>
+              <w:rPr>
+                <w:b w:val="0"/>
+                <w:bCs/>
+              </w:rPr>
+              <w:t>);</w:t>
             </w:r>
           </w:p>
         </w:tc>
       </w:tr>
       <w:tr>
         <w:trPr>
-          <w:trHeight w:val="405"/>
+          <w:trHeight w:val="450"/>
         </w:trPr>
         <w:tc>
           <w:tcPr>
@@ -819,31 +964,365 @@
               <w:bottom w:val="single" w:sz="4" w:space="0" w:color="000000"/>
               <w:right w:val="single" w:sz="4" w:space="0" w:color="000000"/>
             </w:tcBorders>
-            <w:shd w:val="clear" w:color="auto" w:fill="auto"/>
+          </w:tcPr>
+          <w:p>
+            <w:pPr>
+              <w:tabs>
+                <w:tab w:val="left" w:pos="360"/>
+              </w:tabs>
+              <w:jc w:val="center"/>
+              <w:rPr>
+                <w:b/>
+                <w:sz w:val="28"/>
+                <w:szCs w:val="28"/>
+              </w:rPr>
+            </w:pPr>
+            <w:r>
+              <w:rPr>
+                <w:b/>
+                <w:sz w:val="28"/>
+                <w:szCs w:val="28"/>
+              </w:rPr>
+              <w:t>Fluxo Alternativo</w:t>
+            </w:r>
+          </w:p>
+        </w:tc>
+      </w:tr>
+      <w:tr>
+        <w:trPr>
+          <w:trHeight w:val="289"/>
+        </w:trPr>
+        <w:tc>
+          <w:tcPr>
+            <w:tcW w:w="10330" w:type="dxa"/>
+            <w:gridSpan w:val="2"/>
+            <w:tcBorders>
+              <w:top w:val="single" w:sz="4" w:space="0" w:color="000000"/>
+              <w:left w:val="single" w:sz="4" w:space="0" w:color="000000"/>
+              <w:bottom w:val="single" w:sz="4" w:space="0" w:color="000000"/>
+              <w:right w:val="single" w:sz="4" w:space="0" w:color="000000"/>
+            </w:tcBorders>
+          </w:tcPr>
+          <w:p>
+            <w:pPr>
+              <w:tabs>
+                <w:tab w:val="left" w:pos="360"/>
+              </w:tabs>
+              <w:rPr>
+                <w:sz w:val="28"/>
+                <w:szCs w:val="28"/>
+              </w:rPr>
+            </w:pPr>
+            <w:r>
+              <w:rPr>
+                <w:b/>
+                <w:sz w:val="28"/>
+                <w:szCs w:val="28"/>
+              </w:rPr>
+              <w:t xml:space="preserve">Linha </w:t>
+            </w:r>
+            <w:r>
+              <w:rPr>
+                <w:b/>
+                <w:sz w:val="28"/>
+                <w:szCs w:val="28"/>
+              </w:rPr>
+              <w:t>1</w:t>
+            </w:r>
+            <w:r>
+              <w:rPr>
+                <w:b/>
+                <w:sz w:val="28"/>
+                <w:szCs w:val="28"/>
+              </w:rPr>
+              <w:t xml:space="preserve">: </w:t>
+            </w:r>
+            <w:r>
+              <w:rPr>
+                <w:sz w:val="28"/>
+                <w:szCs w:val="28"/>
+              </w:rPr>
+              <w:t>A</w:t>
+            </w:r>
+            <w:r>
+              <w:rPr>
+                <w:sz w:val="28"/>
+                <w:szCs w:val="28"/>
+              </w:rPr>
+              <w:t>tor Seleciona o botão “Voltar” e o sistema volta a exibir a tela Inicial(</w:t>
+            </w:r>
+            <w:r>
+              <w:rPr>
+                <w:color w:val="EE0000"/>
+                <w:sz w:val="28"/>
+                <w:szCs w:val="28"/>
+              </w:rPr>
+              <w:t>Tela_W17</w:t>
+            </w:r>
+            <w:r>
+              <w:rPr>
+                <w:sz w:val="28"/>
+                <w:szCs w:val="28"/>
+              </w:rPr>
+              <w:t>)</w:t>
+            </w:r>
+          </w:p>
+          <w:p>
+            <w:pPr>
+              <w:tabs>
+                <w:tab w:val="left" w:pos="360"/>
+              </w:tabs>
+              <w:rPr>
+                <w:b/>
+                <w:sz w:val="28"/>
+                <w:szCs w:val="28"/>
+              </w:rPr>
+            </w:pPr>
+          </w:p>
+        </w:tc>
+      </w:tr>
+      <w:tr>
+        <w:trPr>
+          <w:trHeight w:val="289"/>
+        </w:trPr>
+        <w:tc>
+          <w:tcPr>
+            <w:tcW w:w="10330" w:type="dxa"/>
+            <w:gridSpan w:val="2"/>
+            <w:tcBorders>
+              <w:top w:val="single" w:sz="4" w:space="0" w:color="000000"/>
+              <w:left w:val="single" w:sz="4" w:space="0" w:color="000000"/>
+              <w:bottom w:val="single" w:sz="4" w:space="0" w:color="000000"/>
+              <w:right w:val="single" w:sz="4" w:space="0" w:color="000000"/>
+            </w:tcBorders>
+          </w:tcPr>
+          <w:p>
+            <w:pPr>
+              <w:tabs>
+                <w:tab w:val="left" w:pos="360"/>
+              </w:tabs>
+              <w:jc w:val="center"/>
+              <w:rPr>
+                <w:b/>
+                <w:sz w:val="28"/>
+                <w:szCs w:val="28"/>
+              </w:rPr>
+            </w:pPr>
+            <w:r>
+              <w:rPr>
+                <w:b/>
+                <w:sz w:val="28"/>
+                <w:szCs w:val="28"/>
+              </w:rPr>
+              <w:t>Fluxo de Exceção</w:t>
+            </w:r>
+          </w:p>
+        </w:tc>
+      </w:tr>
+      <w:tr>
+        <w:trPr>
+          <w:trHeight w:val="289"/>
+        </w:trPr>
+        <w:tc>
+          <w:tcPr>
+            <w:tcW w:w="10330" w:type="dxa"/>
+            <w:gridSpan w:val="2"/>
+            <w:tcBorders>
+              <w:top w:val="single" w:sz="4" w:space="0" w:color="000000"/>
+              <w:left w:val="single" w:sz="4" w:space="0" w:color="000000"/>
+              <w:bottom w:val="single" w:sz="4" w:space="0" w:color="000000"/>
+              <w:right w:val="single" w:sz="4" w:space="0" w:color="000000"/>
+            </w:tcBorders>
+          </w:tcPr>
+          <w:p>
+            <w:pPr>
+              <w:tabs>
+                <w:tab w:val="left" w:pos="360"/>
+              </w:tabs>
+              <w:rPr>
+                <w:b/>
+                <w:sz w:val="28"/>
+                <w:szCs w:val="28"/>
+              </w:rPr>
+            </w:pPr>
+            <w:r>
+              <w:rPr>
+                <w:b/>
+                <w:bCs/>
+                <w:sz w:val="28"/>
+                <w:szCs w:val="28"/>
+              </w:rPr>
+              <w:t xml:space="preserve">Linha </w:t>
+            </w:r>
+            <w:r>
+              <w:rPr>
+                <w:b/>
+                <w:bCs/>
+                <w:sz w:val="28"/>
+                <w:szCs w:val="28"/>
+              </w:rPr>
+              <w:t>2</w:t>
+            </w:r>
+            <w:r>
+              <w:rPr>
+                <w:sz w:val="28"/>
+                <w:szCs w:val="28"/>
+              </w:rPr>
+              <w:t>: Restaurante não se encontra em meio persistente, exibindo a mensagem “Restaurante não encontrado!”, retornando para tela que lista todos os restaurantes cadastrados no sistema (</w:t>
+            </w:r>
+            <w:r>
+              <w:rPr>
+                <w:color w:val="EE0000"/>
+                <w:sz w:val="28"/>
+                <w:szCs w:val="28"/>
+              </w:rPr>
+              <w:t>Tela_W18</w:t>
+            </w:r>
+            <w:r>
+              <w:rPr>
+                <w:sz w:val="28"/>
+                <w:szCs w:val="28"/>
+              </w:rPr>
+              <w:t>).</w:t>
+            </w:r>
+          </w:p>
+        </w:tc>
+      </w:tr>
+    </w:tbl>
+    <w:p>
+      <w:pPr>
+        <w:jc w:val="center"/>
+      </w:pPr>
+    </w:p>
+    <w:p>
+      <w:pPr>
+        <w:jc w:val="center"/>
+      </w:pPr>
+    </w:p>
+    <w:p>
+      <w:pPr>
+        <w:jc w:val="center"/>
+      </w:pPr>
+    </w:p>
+    <w:p>
+      <w:pPr>
+        <w:jc w:val="center"/>
+      </w:pPr>
+    </w:p>
+    <w:p>
+      <w:pPr>
+        <w:pStyle w:val="Ttulo1"/>
+        <w:numPr>
+          <w:ilvl w:val="0"/>
+          <w:numId w:val="2"/>
+        </w:numPr>
+      </w:pPr>
+      <w:r>
+        <w:lastRenderedPageBreak/>
+        <w:t xml:space="preserve">Seção: </w:t>
+      </w:r>
+      <w:r>
+        <w:rPr>
+          <w:b w:val="0"/>
+        </w:rPr>
+        <w:t>Excluir</w:t>
+      </w:r>
+      <w:r>
+        <w:rPr>
+          <w:b w:val="0"/>
+        </w:rPr>
+        <w:t xml:space="preserve"> Restaurante</w:t>
+      </w:r>
+    </w:p>
+    <w:tbl>
+      <w:tblPr>
+        <w:tblW w:w="10330" w:type="dxa"/>
+        <w:tblInd w:w="-70" w:type="dxa"/>
+        <w:tblLayout w:type="fixed"/>
+        <w:tblLook w:val="0000" w:firstRow="0" w:lastRow="0" w:firstColumn="0" w:lastColumn="0" w:noHBand="0" w:noVBand="0"/>
+      </w:tblPr>
+      <w:tblGrid>
+        <w:gridCol w:w="2905"/>
+        <w:gridCol w:w="7425"/>
+      </w:tblGrid>
+      <w:tr>
+        <w:tc>
+          <w:tcPr>
+            <w:tcW w:w="2905" w:type="dxa"/>
+            <w:tcBorders>
+              <w:top w:val="single" w:sz="4" w:space="0" w:color="000000"/>
+              <w:left w:val="single" w:sz="4" w:space="0" w:color="000000"/>
+              <w:bottom w:val="single" w:sz="4" w:space="0" w:color="000000"/>
+              <w:right w:val="single" w:sz="4" w:space="0" w:color="000000"/>
+            </w:tcBorders>
+          </w:tcPr>
+          <w:p>
+            <w:r>
+              <w:rPr>
+                <w:b/>
+                <w:sz w:val="28"/>
+                <w:szCs w:val="28"/>
+              </w:rPr>
+              <w:t>Sumário</w:t>
+            </w:r>
+          </w:p>
+        </w:tc>
+        <w:tc>
+          <w:tcPr>
+            <w:tcW w:w="7425" w:type="dxa"/>
+            <w:tcBorders>
+              <w:top w:val="single" w:sz="4" w:space="0" w:color="000000"/>
+              <w:left w:val="single" w:sz="4" w:space="0" w:color="000000"/>
+              <w:bottom w:val="single" w:sz="4" w:space="0" w:color="000000"/>
+              <w:right w:val="single" w:sz="4" w:space="0" w:color="000000"/>
+            </w:tcBorders>
+          </w:tcPr>
+          <w:p>
+            <w:r>
+              <w:rPr>
+                <w:sz w:val="28"/>
+                <w:szCs w:val="28"/>
+              </w:rPr>
+              <w:t>Permite o administrador excluir determinado restaurante.</w:t>
+            </w:r>
+          </w:p>
+        </w:tc>
+      </w:tr>
+      <w:tr>
+        <w:trPr>
+          <w:cantSplit/>
+        </w:trPr>
+        <w:tc>
+          <w:tcPr>
+            <w:tcW w:w="10330" w:type="dxa"/>
+            <w:gridSpan w:val="2"/>
+            <w:tcBorders>
+              <w:top w:val="single" w:sz="4" w:space="0" w:color="000000"/>
+              <w:left w:val="single" w:sz="4" w:space="0" w:color="000000"/>
+              <w:bottom w:val="single" w:sz="4" w:space="0" w:color="000000"/>
+              <w:right w:val="single" w:sz="4" w:space="0" w:color="000000"/>
+            </w:tcBorders>
           </w:tcPr>
           <w:p>
             <w:pPr>
               <w:pStyle w:val="Ttulo2"/>
               <w:numPr>
                 <w:ilvl w:val="1"/>
-                <w:numId w:val="1"/>
+                <w:numId w:val="2"/>
               </w:numPr>
-              <w:ind w:left="360"/>
-            </w:pPr>
-            <w:bookmarkStart w:id="0" w:name="_heading=h.5pvsygsayg8" w:colFirst="0" w:colLast="0"/>
-            <w:bookmarkEnd w:id="0"/>
+            </w:pPr>
             <w:r>
               <w:rPr>
                 <w:b/>
               </w:rPr>
-              <w:t>Fluxo Alternativo</w:t>
+              <w:t>Fluxo Principal</w:t>
             </w:r>
           </w:p>
         </w:tc>
       </w:tr>
       <w:tr>
         <w:trPr>
-          <w:trHeight w:val="823"/>
+          <w:trHeight w:val="868"/>
         </w:trPr>
         <w:tc>
           <w:tcPr>
@@ -855,34 +1334,477 @@
               <w:bottom w:val="single" w:sz="4" w:space="0" w:color="000000"/>
               <w:right w:val="single" w:sz="4" w:space="0" w:color="000000"/>
             </w:tcBorders>
-            <w:shd w:val="clear" w:color="auto" w:fill="auto"/>
-          </w:tcPr>
-          <w:p>
-            <w:pPr>
+          </w:tcPr>
+          <w:p>
+            <w:pPr>
+              <w:pStyle w:val="PargrafodaLista"/>
+              <w:numPr>
+                <w:ilvl w:val="0"/>
+                <w:numId w:val="6"/>
+              </w:numPr>
               <w:tabs>
                 <w:tab w:val="left" w:pos="360"/>
               </w:tabs>
-              <w:jc w:val="both"/>
+              <w:rPr>
+                <w:sz w:val="28"/>
+                <w:szCs w:val="28"/>
+              </w:rPr>
+            </w:pPr>
+            <w:r>
+              <w:rPr>
+                <w:sz w:val="28"/>
+                <w:szCs w:val="28"/>
+              </w:rPr>
+              <w:t>Ator seleciona opção de “Visualizar”.</w:t>
+            </w:r>
+          </w:p>
+          <w:p>
+            <w:pPr>
+              <w:pStyle w:val="PargrafodaLista"/>
+              <w:numPr>
+                <w:ilvl w:val="0"/>
+                <w:numId w:val="6"/>
+              </w:numPr>
+              <w:tabs>
+                <w:tab w:val="left" w:pos="360"/>
+              </w:tabs>
+              <w:rPr>
+                <w:sz w:val="28"/>
+                <w:szCs w:val="28"/>
+              </w:rPr>
+            </w:pPr>
+            <w:r>
+              <w:rPr>
+                <w:sz w:val="28"/>
+                <w:szCs w:val="28"/>
+              </w:rPr>
+              <w:t>Sistema exibe os dados cadastrados do restaurante(</w:t>
+            </w:r>
+            <w:r>
               <w:rPr>
                 <w:color w:val="FF0000"/>
                 <w:sz w:val="28"/>
                 <w:szCs w:val="28"/>
               </w:rPr>
-            </w:pPr>
-            <w:r>
+              <w:t>Tela_W21</w:t>
+            </w:r>
+            <w:r>
+              <w:rPr>
+                <w:sz w:val="28"/>
+                <w:szCs w:val="28"/>
+              </w:rPr>
+              <w:t>)</w:t>
+            </w:r>
+          </w:p>
+          <w:p>
+            <w:pPr>
+              <w:pStyle w:val="PargrafodaLista"/>
+              <w:numPr>
+                <w:ilvl w:val="0"/>
+                <w:numId w:val="6"/>
+              </w:numPr>
+              <w:tabs>
+                <w:tab w:val="left" w:pos="360"/>
+              </w:tabs>
+              <w:rPr>
+                <w:sz w:val="28"/>
+                <w:szCs w:val="28"/>
+              </w:rPr>
+            </w:pPr>
+            <w:r>
+              <w:rPr>
+                <w:sz w:val="28"/>
+                <w:szCs w:val="28"/>
+              </w:rPr>
+              <w:t>Ator seleciona opção “Remover Restaurante”</w:t>
+            </w:r>
+            <w:r>
+              <w:rPr>
+                <w:sz w:val="28"/>
+                <w:szCs w:val="28"/>
+              </w:rPr>
+              <w:t>.</w:t>
+            </w:r>
+          </w:p>
+          <w:p>
+            <w:pPr>
+              <w:pStyle w:val="PargrafodaLista"/>
+              <w:numPr>
+                <w:ilvl w:val="0"/>
+                <w:numId w:val="6"/>
+              </w:numPr>
+              <w:tabs>
+                <w:tab w:val="left" w:pos="360"/>
+              </w:tabs>
+              <w:rPr>
+                <w:sz w:val="28"/>
+                <w:szCs w:val="28"/>
+              </w:rPr>
+            </w:pPr>
+            <w:r>
+              <w:rPr>
+                <w:sz w:val="28"/>
+                <w:szCs w:val="28"/>
+              </w:rPr>
+              <w:t>Sistema exibe a mensagem “Deseja Prosseguir?”(</w:t>
+            </w:r>
+            <w:r>
+              <w:rPr>
+                <w:color w:val="EE0000"/>
+                <w:sz w:val="28"/>
+                <w:szCs w:val="28"/>
+              </w:rPr>
+              <w:t>Tela_W14</w:t>
+            </w:r>
+            <w:r>
+              <w:rPr>
+                <w:sz w:val="28"/>
+                <w:szCs w:val="28"/>
+              </w:rPr>
+              <w:t>)</w:t>
+            </w:r>
+          </w:p>
+          <w:p>
+            <w:pPr>
+              <w:pStyle w:val="PargrafodaLista"/>
+              <w:numPr>
+                <w:ilvl w:val="0"/>
+                <w:numId w:val="6"/>
+              </w:numPr>
+              <w:tabs>
+                <w:tab w:val="left" w:pos="360"/>
+              </w:tabs>
+              <w:rPr>
+                <w:sz w:val="28"/>
+                <w:szCs w:val="28"/>
+              </w:rPr>
+            </w:pPr>
+            <w:r>
+              <w:rPr>
+                <w:sz w:val="28"/>
+                <w:szCs w:val="28"/>
+              </w:rPr>
+              <w:t>Ator confirma a remoção clicando no “Sim”.</w:t>
+            </w:r>
+          </w:p>
+          <w:p>
+            <w:pPr>
+              <w:pStyle w:val="PargrafodaLista"/>
+              <w:numPr>
+                <w:ilvl w:val="0"/>
+                <w:numId w:val="6"/>
+              </w:numPr>
+              <w:tabs>
+                <w:tab w:val="left" w:pos="360"/>
+              </w:tabs>
+              <w:rPr>
+                <w:sz w:val="28"/>
+                <w:szCs w:val="28"/>
+              </w:rPr>
+            </w:pPr>
+            <w:r>
+              <w:rPr>
+                <w:sz w:val="28"/>
+                <w:szCs w:val="28"/>
+              </w:rPr>
+              <w:t>Sistema exclui os dados do restaurante do meio persistente.</w:t>
+            </w:r>
+          </w:p>
+        </w:tc>
+      </w:tr>
+      <w:tr>
+        <w:trPr>
+          <w:trHeight w:val="450"/>
+        </w:trPr>
+        <w:tc>
+          <w:tcPr>
+            <w:tcW w:w="10330" w:type="dxa"/>
+            <w:gridSpan w:val="2"/>
+            <w:tcBorders>
+              <w:top w:val="single" w:sz="4" w:space="0" w:color="000000"/>
+              <w:left w:val="single" w:sz="4" w:space="0" w:color="000000"/>
+              <w:bottom w:val="single" w:sz="4" w:space="0" w:color="000000"/>
+              <w:right w:val="single" w:sz="4" w:space="0" w:color="000000"/>
+            </w:tcBorders>
+          </w:tcPr>
+          <w:p>
+            <w:pPr>
+              <w:tabs>
+                <w:tab w:val="left" w:pos="360"/>
+              </w:tabs>
+              <w:jc w:val="center"/>
               <w:rPr>
                 <w:b/>
                 <w:sz w:val="28"/>
                 <w:szCs w:val="28"/>
               </w:rPr>
-              <w:t xml:space="preserve">Linha 3: </w:t>
-            </w:r>
-            <w:r>
-              <w:rPr>
-                <w:sz w:val="28"/>
-                <w:szCs w:val="28"/>
-              </w:rPr>
-              <w:t>Ator pressiona botão “Voltar”. Sistema retorna à tela inicial do sistema (</w:t>
+            </w:pPr>
+            <w:r>
+              <w:rPr>
+                <w:b/>
+                <w:sz w:val="28"/>
+                <w:szCs w:val="28"/>
+              </w:rPr>
+              <w:t>Fluxo Alternativo</w:t>
+            </w:r>
+          </w:p>
+        </w:tc>
+      </w:tr>
+      <w:tr>
+        <w:trPr>
+          <w:trHeight w:val="289"/>
+        </w:trPr>
+        <w:tc>
+          <w:tcPr>
+            <w:tcW w:w="10330" w:type="dxa"/>
+            <w:gridSpan w:val="2"/>
+            <w:tcBorders>
+              <w:top w:val="single" w:sz="4" w:space="0" w:color="000000"/>
+              <w:left w:val="single" w:sz="4" w:space="0" w:color="000000"/>
+              <w:bottom w:val="single" w:sz="4" w:space="0" w:color="000000"/>
+              <w:right w:val="single" w:sz="4" w:space="0" w:color="000000"/>
+            </w:tcBorders>
+          </w:tcPr>
+          <w:p>
+            <w:pPr>
+              <w:tabs>
+                <w:tab w:val="left" w:pos="360"/>
+              </w:tabs>
+              <w:rPr>
+                <w:sz w:val="28"/>
+                <w:szCs w:val="28"/>
+              </w:rPr>
+            </w:pPr>
+            <w:r>
+              <w:rPr>
+                <w:b/>
+                <w:sz w:val="28"/>
+                <w:szCs w:val="28"/>
+              </w:rPr>
+              <w:t xml:space="preserve">Linha 2: </w:t>
+            </w:r>
+            <w:r>
+              <w:rPr>
+                <w:sz w:val="28"/>
+                <w:szCs w:val="28"/>
+              </w:rPr>
+              <w:t xml:space="preserve">Ator Seleciona </w:t>
+            </w:r>
+            <w:r>
+              <w:rPr>
+                <w:sz w:val="28"/>
+                <w:szCs w:val="28"/>
+              </w:rPr>
+              <w:t xml:space="preserve">a opção </w:t>
+            </w:r>
+            <w:r>
+              <w:rPr>
+                <w:sz w:val="28"/>
+                <w:szCs w:val="28"/>
+              </w:rPr>
+              <w:t>“Voltar”</w:t>
+            </w:r>
+            <w:r>
+              <w:rPr>
+                <w:sz w:val="28"/>
+                <w:szCs w:val="28"/>
+              </w:rPr>
+              <w:t xml:space="preserve"> e o s</w:t>
+            </w:r>
+            <w:r>
+              <w:rPr>
+                <w:sz w:val="28"/>
+                <w:szCs w:val="28"/>
+              </w:rPr>
+              <w:t>istema volta a exibir a tela Inicial(</w:t>
+            </w:r>
+            <w:r>
+              <w:rPr>
+                <w:color w:val="EE0000"/>
+                <w:sz w:val="28"/>
+                <w:szCs w:val="28"/>
+              </w:rPr>
+              <w:t>Tela_W17</w:t>
+            </w:r>
+            <w:r>
+              <w:rPr>
+                <w:sz w:val="28"/>
+                <w:szCs w:val="28"/>
+              </w:rPr>
+              <w:t>)</w:t>
+            </w:r>
+            <w:r>
+              <w:rPr>
+                <w:sz w:val="28"/>
+                <w:szCs w:val="28"/>
+              </w:rPr>
+              <w:t>.</w:t>
+            </w:r>
+            <w:r>
+              <w:rPr>
+                <w:sz w:val="28"/>
+                <w:szCs w:val="28"/>
+              </w:rPr>
+              <w:br/>
+            </w:r>
+            <w:r>
+              <w:rPr>
+                <w:b/>
+                <w:bCs/>
+                <w:sz w:val="28"/>
+                <w:szCs w:val="28"/>
+              </w:rPr>
+              <w:t>Linha 4</w:t>
+            </w:r>
+            <w:r>
+              <w:rPr>
+                <w:sz w:val="28"/>
+                <w:szCs w:val="28"/>
+              </w:rPr>
+              <w:t>: Ator seleciona o “Não” e o sistema volta a exibir a tela de dados do restaurante(</w:t>
+            </w:r>
+            <w:r>
+              <w:rPr>
+                <w:color w:val="EE0000"/>
+                <w:sz w:val="28"/>
+                <w:szCs w:val="28"/>
+              </w:rPr>
+              <w:t>Tela_W21</w:t>
+            </w:r>
+            <w:r>
+              <w:rPr>
+                <w:sz w:val="28"/>
+                <w:szCs w:val="28"/>
+              </w:rPr>
+              <w:t>).</w:t>
+            </w:r>
+          </w:p>
+          <w:p>
+            <w:pPr>
+              <w:tabs>
+                <w:tab w:val="left" w:pos="360"/>
+              </w:tabs>
+              <w:rPr>
+                <w:b/>
+                <w:sz w:val="28"/>
+                <w:szCs w:val="28"/>
+              </w:rPr>
+            </w:pPr>
+          </w:p>
+        </w:tc>
+      </w:tr>
+      <w:tr>
+        <w:trPr>
+          <w:trHeight w:val="289"/>
+        </w:trPr>
+        <w:tc>
+          <w:tcPr>
+            <w:tcW w:w="10330" w:type="dxa"/>
+            <w:gridSpan w:val="2"/>
+            <w:tcBorders>
+              <w:top w:val="single" w:sz="4" w:space="0" w:color="000000"/>
+              <w:left w:val="single" w:sz="4" w:space="0" w:color="000000"/>
+              <w:bottom w:val="single" w:sz="4" w:space="0" w:color="000000"/>
+              <w:right w:val="single" w:sz="4" w:space="0" w:color="000000"/>
+            </w:tcBorders>
+          </w:tcPr>
+          <w:p>
+            <w:pPr>
+              <w:tabs>
+                <w:tab w:val="left" w:pos="7584"/>
+              </w:tabs>
+              <w:jc w:val="center"/>
+              <w:rPr>
+                <w:b/>
+                <w:sz w:val="28"/>
+                <w:szCs w:val="28"/>
+              </w:rPr>
+            </w:pPr>
+            <w:r>
+              <w:rPr>
+                <w:b/>
+                <w:sz w:val="28"/>
+                <w:szCs w:val="28"/>
+              </w:rPr>
+              <w:t>Fluxo Exceção</w:t>
+            </w:r>
+          </w:p>
+        </w:tc>
+      </w:tr>
+      <w:tr>
+        <w:trPr>
+          <w:trHeight w:val="1236"/>
+        </w:trPr>
+        <w:tc>
+          <w:tcPr>
+            <w:tcW w:w="10330" w:type="dxa"/>
+            <w:gridSpan w:val="2"/>
+            <w:tcBorders>
+              <w:top w:val="single" w:sz="4" w:space="0" w:color="000000"/>
+              <w:left w:val="single" w:sz="4" w:space="0" w:color="000000"/>
+              <w:bottom w:val="single" w:sz="4" w:space="0" w:color="000000"/>
+              <w:right w:val="single" w:sz="4" w:space="0" w:color="000000"/>
+            </w:tcBorders>
+          </w:tcPr>
+          <w:p>
+            <w:pPr>
+              <w:tabs>
+                <w:tab w:val="left" w:pos="3624"/>
+              </w:tabs>
+              <w:rPr>
+                <w:b/>
+                <w:sz w:val="28"/>
+                <w:szCs w:val="28"/>
+              </w:rPr>
+            </w:pPr>
+            <w:r>
+              <w:rPr>
+                <w:b/>
+                <w:sz w:val="28"/>
+                <w:szCs w:val="28"/>
+              </w:rPr>
+              <w:tab/>
+            </w:r>
+          </w:p>
+          <w:p>
+            <w:r>
+              <w:rPr>
+                <w:b/>
+                <w:sz w:val="28"/>
+                <w:szCs w:val="28"/>
+              </w:rPr>
+              <w:t xml:space="preserve">Linha </w:t>
+            </w:r>
+            <w:r>
+              <w:rPr>
+                <w:b/>
+                <w:sz w:val="28"/>
+                <w:szCs w:val="28"/>
+              </w:rPr>
+              <w:t>6</w:t>
+            </w:r>
+            <w:r>
+              <w:rPr>
+                <w:b/>
+                <w:sz w:val="28"/>
+                <w:szCs w:val="28"/>
+              </w:rPr>
+              <w:t xml:space="preserve">: </w:t>
+            </w:r>
+            <w:r>
+              <w:rPr>
+                <w:bCs/>
+                <w:sz w:val="28"/>
+                <w:szCs w:val="28"/>
+              </w:rPr>
+              <w:t xml:space="preserve">Ocorre uma falha durante a exclusão dos dados do cliente, exibindo a mensagem “Não foi possível excluir os dados, tente novamente!”. Retornando para tela </w:t>
+            </w:r>
+            <w:r>
+              <w:rPr>
+                <w:sz w:val="28"/>
+                <w:szCs w:val="28"/>
+              </w:rPr>
+              <w:t>(</w:t>
             </w:r>
             <w:r>
               <w:rPr>
@@ -890,7 +1812,15 @@
                 <w:sz w:val="28"/>
                 <w:szCs w:val="28"/>
               </w:rPr>
-              <w:t>Tela_W17</w:t>
+              <w:t>Tela_</w:t>
+            </w:r>
+            <w:r>
+              <w:rPr>
+                <w:color w:val="FF0000"/>
+                <w:sz w:val="28"/>
+                <w:szCs w:val="28"/>
+              </w:rPr>
+              <w:t>W21</w:t>
             </w:r>
             <w:r>
               <w:rPr>
@@ -899,6 +1829,19 @@
               </w:rPr>
               <w:t>).</w:t>
             </w:r>
+          </w:p>
+          <w:p/>
+          <w:p>
+            <w:pPr>
+              <w:tabs>
+                <w:tab w:val="left" w:pos="3624"/>
+              </w:tabs>
+              <w:rPr>
+                <w:b/>
+                <w:sz w:val="28"/>
+                <w:szCs w:val="28"/>
+              </w:rPr>
+            </w:pPr>
           </w:p>
         </w:tc>
       </w:tr>
@@ -911,15 +1854,668 @@
     <w:p>
       <w:pPr>
         <w:pStyle w:val="Ttulo1"/>
+        <w:numPr>
+          <w:ilvl w:val="0"/>
+          <w:numId w:val="2"/>
+        </w:numPr>
       </w:pPr>
       <w:bookmarkStart w:id="1" w:name="_heading=h.12ufc6ycveq8" w:colFirst="0" w:colLast="0"/>
       <w:bookmarkEnd w:id="1"/>
+      <w:r>
+        <w:t xml:space="preserve">Seção: </w:t>
+      </w:r>
+      <w:r>
+        <w:rPr>
+          <w:b w:val="0"/>
+        </w:rPr>
+        <w:t>Adicionar</w:t>
+      </w:r>
+      <w:r>
+        <w:rPr>
+          <w:b w:val="0"/>
+        </w:rPr>
+        <w:t xml:space="preserve"> Restaurante</w:t>
+      </w:r>
     </w:p>
-    <w:p>
-      <w:pPr>
-        <w:pStyle w:val="Ttulo1"/>
-      </w:pPr>
-    </w:p>
+    <w:tbl>
+      <w:tblPr>
+        <w:tblW w:w="10330" w:type="dxa"/>
+        <w:tblInd w:w="-70" w:type="dxa"/>
+        <w:tblLayout w:type="fixed"/>
+        <w:tblLook w:val="0000" w:firstRow="0" w:lastRow="0" w:firstColumn="0" w:lastColumn="0" w:noHBand="0" w:noVBand="0"/>
+      </w:tblPr>
+      <w:tblGrid>
+        <w:gridCol w:w="2905"/>
+        <w:gridCol w:w="7425"/>
+      </w:tblGrid>
+      <w:tr>
+        <w:tc>
+          <w:tcPr>
+            <w:tcW w:w="2905" w:type="dxa"/>
+            <w:tcBorders>
+              <w:top w:val="single" w:sz="4" w:space="0" w:color="000000"/>
+              <w:left w:val="single" w:sz="4" w:space="0" w:color="000000"/>
+              <w:bottom w:val="single" w:sz="4" w:space="0" w:color="000000"/>
+              <w:right w:val="single" w:sz="4" w:space="0" w:color="000000"/>
+            </w:tcBorders>
+          </w:tcPr>
+          <w:p>
+            <w:r>
+              <w:rPr>
+                <w:b/>
+                <w:sz w:val="28"/>
+                <w:szCs w:val="28"/>
+              </w:rPr>
+              <w:t>Sumário</w:t>
+            </w:r>
+          </w:p>
+        </w:tc>
+        <w:tc>
+          <w:tcPr>
+            <w:tcW w:w="7425" w:type="dxa"/>
+            <w:tcBorders>
+              <w:top w:val="single" w:sz="4" w:space="0" w:color="000000"/>
+              <w:left w:val="single" w:sz="4" w:space="0" w:color="000000"/>
+              <w:bottom w:val="single" w:sz="4" w:space="0" w:color="000000"/>
+              <w:right w:val="single" w:sz="4" w:space="0" w:color="000000"/>
+            </w:tcBorders>
+          </w:tcPr>
+          <w:p>
+            <w:r>
+              <w:rPr>
+                <w:sz w:val="28"/>
+                <w:szCs w:val="28"/>
+              </w:rPr>
+              <w:t xml:space="preserve">Permite o administrador </w:t>
+            </w:r>
+            <w:r>
+              <w:rPr>
+                <w:sz w:val="28"/>
+                <w:szCs w:val="28"/>
+              </w:rPr>
+              <w:t>adicionar</w:t>
+            </w:r>
+            <w:r>
+              <w:rPr>
+                <w:sz w:val="28"/>
+                <w:szCs w:val="28"/>
+              </w:rPr>
+              <w:t xml:space="preserve"> determinado restaurante.</w:t>
+            </w:r>
+          </w:p>
+        </w:tc>
+      </w:tr>
+      <w:tr>
+        <w:trPr>
+          <w:cantSplit/>
+        </w:trPr>
+        <w:tc>
+          <w:tcPr>
+            <w:tcW w:w="10330" w:type="dxa"/>
+            <w:gridSpan w:val="2"/>
+            <w:tcBorders>
+              <w:top w:val="single" w:sz="4" w:space="0" w:color="000000"/>
+              <w:left w:val="single" w:sz="4" w:space="0" w:color="000000"/>
+              <w:bottom w:val="single" w:sz="4" w:space="0" w:color="000000"/>
+              <w:right w:val="single" w:sz="4" w:space="0" w:color="000000"/>
+            </w:tcBorders>
+          </w:tcPr>
+          <w:p>
+            <w:pPr>
+              <w:pStyle w:val="Ttulo2"/>
+              <w:numPr>
+                <w:ilvl w:val="1"/>
+                <w:numId w:val="2"/>
+              </w:numPr>
+            </w:pPr>
+            <w:r>
+              <w:rPr>
+                <w:b/>
+              </w:rPr>
+              <w:t>Fluxo Principal</w:t>
+            </w:r>
+          </w:p>
+        </w:tc>
+      </w:tr>
+      <w:tr>
+        <w:trPr>
+          <w:trHeight w:val="868"/>
+        </w:trPr>
+        <w:tc>
+          <w:tcPr>
+            <w:tcW w:w="10330" w:type="dxa"/>
+            <w:gridSpan w:val="2"/>
+            <w:tcBorders>
+              <w:top w:val="single" w:sz="4" w:space="0" w:color="000000"/>
+              <w:left w:val="single" w:sz="4" w:space="0" w:color="000000"/>
+              <w:bottom w:val="single" w:sz="4" w:space="0" w:color="000000"/>
+              <w:right w:val="single" w:sz="4" w:space="0" w:color="000000"/>
+            </w:tcBorders>
+          </w:tcPr>
+          <w:p>
+            <w:pPr>
+              <w:pStyle w:val="Ttulo1"/>
+              <w:numPr>
+                <w:ilvl w:val="0"/>
+                <w:numId w:val="11"/>
+              </w:numPr>
+              <w:rPr>
+                <w:b w:val="0"/>
+                <w:bCs/>
+              </w:rPr>
+            </w:pPr>
+            <w:r>
+              <w:rPr>
+                <w:b w:val="0"/>
+                <w:bCs/>
+              </w:rPr>
+              <w:t>Sistema exibe a tela de “Cadastrar Restaurante”(</w:t>
+            </w:r>
+            <w:r>
+              <w:rPr>
+                <w:b w:val="0"/>
+                <w:bCs/>
+                <w:color w:val="EE0000"/>
+              </w:rPr>
+              <w:t>Tela_W20</w:t>
+            </w:r>
+            <w:r>
+              <w:rPr>
+                <w:b w:val="0"/>
+                <w:bCs/>
+              </w:rPr>
+              <w:t>).</w:t>
+            </w:r>
+          </w:p>
+          <w:p>
+            <w:pPr>
+              <w:pStyle w:val="PargrafodaLista"/>
+              <w:numPr>
+                <w:ilvl w:val="0"/>
+                <w:numId w:val="11"/>
+              </w:numPr>
+              <w:rPr>
+                <w:sz w:val="28"/>
+                <w:szCs w:val="28"/>
+              </w:rPr>
+            </w:pPr>
+            <w:r>
+              <w:rPr>
+                <w:sz w:val="28"/>
+                <w:szCs w:val="28"/>
+              </w:rPr>
+              <w:t>Ator preenche os dados de cadastro necessário.</w:t>
+            </w:r>
+          </w:p>
+          <w:p>
+            <w:pPr>
+              <w:pStyle w:val="PargrafodaLista"/>
+              <w:numPr>
+                <w:ilvl w:val="0"/>
+                <w:numId w:val="11"/>
+              </w:numPr>
+              <w:rPr>
+                <w:sz w:val="28"/>
+                <w:szCs w:val="28"/>
+              </w:rPr>
+            </w:pPr>
+            <w:r>
+              <w:rPr>
+                <w:sz w:val="28"/>
+                <w:szCs w:val="28"/>
+              </w:rPr>
+              <w:t>Ator seleciona a opção “Cadastrar Restaurante”</w:t>
+            </w:r>
+          </w:p>
+          <w:p>
+            <w:pPr>
+              <w:pStyle w:val="PargrafodaLista"/>
+              <w:numPr>
+                <w:ilvl w:val="0"/>
+                <w:numId w:val="11"/>
+              </w:numPr>
+              <w:rPr>
+                <w:sz w:val="28"/>
+                <w:szCs w:val="28"/>
+              </w:rPr>
+            </w:pPr>
+            <w:r>
+              <w:rPr>
+                <w:sz w:val="28"/>
+                <w:szCs w:val="28"/>
+              </w:rPr>
+              <w:t>Sistema exibe a tela de confirmação(</w:t>
+            </w:r>
+            <w:r>
+              <w:rPr>
+                <w:color w:val="EE0000"/>
+                <w:sz w:val="28"/>
+                <w:szCs w:val="28"/>
+              </w:rPr>
+              <w:t>Tela_W14</w:t>
+            </w:r>
+            <w:r>
+              <w:rPr>
+                <w:sz w:val="28"/>
+                <w:szCs w:val="28"/>
+              </w:rPr>
+              <w:t>)</w:t>
+            </w:r>
+          </w:p>
+          <w:p>
+            <w:pPr>
+              <w:pStyle w:val="PargrafodaLista"/>
+              <w:numPr>
+                <w:ilvl w:val="0"/>
+                <w:numId w:val="11"/>
+              </w:numPr>
+              <w:rPr>
+                <w:sz w:val="28"/>
+                <w:szCs w:val="28"/>
+              </w:rPr>
+            </w:pPr>
+            <w:r>
+              <w:rPr>
+                <w:sz w:val="28"/>
+                <w:szCs w:val="28"/>
+              </w:rPr>
+              <w:t>Ator seleciona “Sim”</w:t>
+            </w:r>
+            <w:r>
+              <w:rPr>
+                <w:sz w:val="28"/>
+                <w:szCs w:val="28"/>
+              </w:rPr>
+              <w:br/>
+            </w:r>
+            <w:r>
+              <w:rPr>
+                <w:sz w:val="28"/>
+                <w:szCs w:val="28"/>
+              </w:rPr>
+              <w:t xml:space="preserve">Sistema </w:t>
+            </w:r>
+            <w:r>
+              <w:rPr>
+                <w:sz w:val="28"/>
+                <w:szCs w:val="28"/>
+              </w:rPr>
+              <w:t>inclui</w:t>
+            </w:r>
+            <w:r>
+              <w:rPr>
+                <w:sz w:val="28"/>
+                <w:szCs w:val="28"/>
+              </w:rPr>
+              <w:t xml:space="preserve"> os dados do restaurante </w:t>
+            </w:r>
+            <w:r>
+              <w:rPr>
+                <w:sz w:val="28"/>
+                <w:szCs w:val="28"/>
+              </w:rPr>
+              <w:t>n</w:t>
+            </w:r>
+            <w:r>
+              <w:rPr>
+                <w:sz w:val="28"/>
+                <w:szCs w:val="28"/>
+              </w:rPr>
+              <w:t>o meio persistente.</w:t>
+            </w:r>
+          </w:p>
+          <w:p/>
+          <w:p/>
+        </w:tc>
+      </w:tr>
+      <w:tr>
+        <w:trPr>
+          <w:trHeight w:val="450"/>
+        </w:trPr>
+        <w:tc>
+          <w:tcPr>
+            <w:tcW w:w="10330" w:type="dxa"/>
+            <w:gridSpan w:val="2"/>
+            <w:tcBorders>
+              <w:top w:val="single" w:sz="4" w:space="0" w:color="000000"/>
+              <w:left w:val="single" w:sz="4" w:space="0" w:color="000000"/>
+              <w:bottom w:val="single" w:sz="4" w:space="0" w:color="000000"/>
+              <w:right w:val="single" w:sz="4" w:space="0" w:color="000000"/>
+            </w:tcBorders>
+          </w:tcPr>
+          <w:p>
+            <w:pPr>
+              <w:tabs>
+                <w:tab w:val="left" w:pos="360"/>
+              </w:tabs>
+              <w:jc w:val="center"/>
+              <w:rPr>
+                <w:b/>
+                <w:sz w:val="28"/>
+                <w:szCs w:val="28"/>
+              </w:rPr>
+            </w:pPr>
+            <w:r>
+              <w:rPr>
+                <w:b/>
+                <w:sz w:val="28"/>
+                <w:szCs w:val="28"/>
+              </w:rPr>
+              <w:t>Fluxo Alternativo</w:t>
+            </w:r>
+          </w:p>
+        </w:tc>
+      </w:tr>
+      <w:tr>
+        <w:trPr>
+          <w:trHeight w:val="289"/>
+        </w:trPr>
+        <w:tc>
+          <w:tcPr>
+            <w:tcW w:w="10330" w:type="dxa"/>
+            <w:gridSpan w:val="2"/>
+            <w:tcBorders>
+              <w:top w:val="single" w:sz="4" w:space="0" w:color="000000"/>
+              <w:left w:val="single" w:sz="4" w:space="0" w:color="000000"/>
+              <w:bottom w:val="single" w:sz="4" w:space="0" w:color="000000"/>
+              <w:right w:val="single" w:sz="4" w:space="0" w:color="000000"/>
+            </w:tcBorders>
+          </w:tcPr>
+          <w:p>
+            <w:pPr>
+              <w:tabs>
+                <w:tab w:val="left" w:pos="360"/>
+              </w:tabs>
+              <w:rPr>
+                <w:sz w:val="28"/>
+                <w:szCs w:val="28"/>
+              </w:rPr>
+            </w:pPr>
+            <w:r>
+              <w:rPr>
+                <w:b/>
+                <w:sz w:val="28"/>
+                <w:szCs w:val="28"/>
+              </w:rPr>
+              <w:t xml:space="preserve">Linha </w:t>
+            </w:r>
+            <w:r>
+              <w:rPr>
+                <w:b/>
+                <w:sz w:val="28"/>
+                <w:szCs w:val="28"/>
+              </w:rPr>
+              <w:t>1</w:t>
+            </w:r>
+            <w:r>
+              <w:rPr>
+                <w:b/>
+                <w:sz w:val="28"/>
+                <w:szCs w:val="28"/>
+              </w:rPr>
+              <w:t xml:space="preserve">: </w:t>
+            </w:r>
+            <w:r>
+              <w:rPr>
+                <w:sz w:val="28"/>
+                <w:szCs w:val="28"/>
+              </w:rPr>
+              <w:t>Ator Seleciona a opção “Voltar” e o sistema volta a exibir a tela Inicial(</w:t>
+            </w:r>
+            <w:r>
+              <w:rPr>
+                <w:color w:val="EE0000"/>
+                <w:sz w:val="28"/>
+                <w:szCs w:val="28"/>
+              </w:rPr>
+              <w:t>Tela_W17</w:t>
+            </w:r>
+            <w:r>
+              <w:rPr>
+                <w:sz w:val="28"/>
+                <w:szCs w:val="28"/>
+              </w:rPr>
+              <w:t>).</w:t>
+            </w:r>
+            <w:r>
+              <w:rPr>
+                <w:sz w:val="28"/>
+                <w:szCs w:val="28"/>
+              </w:rPr>
+              <w:br/>
+            </w:r>
+            <w:r>
+              <w:rPr>
+                <w:b/>
+                <w:bCs/>
+                <w:sz w:val="28"/>
+                <w:szCs w:val="28"/>
+              </w:rPr>
+              <w:t>Linha 4</w:t>
+            </w:r>
+            <w:r>
+              <w:rPr>
+                <w:sz w:val="28"/>
+                <w:szCs w:val="28"/>
+              </w:rPr>
+              <w:t>: Ator seleciona o “Não” e o sistema volta a exibir a tela de dados do restaurante(</w:t>
+            </w:r>
+            <w:r>
+              <w:rPr>
+                <w:color w:val="EE0000"/>
+                <w:sz w:val="28"/>
+                <w:szCs w:val="28"/>
+              </w:rPr>
+              <w:t>Tela_W21</w:t>
+            </w:r>
+            <w:r>
+              <w:rPr>
+                <w:sz w:val="28"/>
+                <w:szCs w:val="28"/>
+              </w:rPr>
+              <w:t>).</w:t>
+            </w:r>
+          </w:p>
+          <w:p>
+            <w:pPr>
+              <w:tabs>
+                <w:tab w:val="left" w:pos="360"/>
+              </w:tabs>
+              <w:rPr>
+                <w:b/>
+                <w:sz w:val="28"/>
+                <w:szCs w:val="28"/>
+              </w:rPr>
+            </w:pPr>
+          </w:p>
+        </w:tc>
+      </w:tr>
+      <w:tr>
+        <w:trPr>
+          <w:trHeight w:val="289"/>
+        </w:trPr>
+        <w:tc>
+          <w:tcPr>
+            <w:tcW w:w="10330" w:type="dxa"/>
+            <w:gridSpan w:val="2"/>
+            <w:tcBorders>
+              <w:top w:val="single" w:sz="4" w:space="0" w:color="000000"/>
+              <w:left w:val="single" w:sz="4" w:space="0" w:color="000000"/>
+              <w:bottom w:val="single" w:sz="4" w:space="0" w:color="000000"/>
+              <w:right w:val="single" w:sz="4" w:space="0" w:color="000000"/>
+            </w:tcBorders>
+          </w:tcPr>
+          <w:p>
+            <w:pPr>
+              <w:tabs>
+                <w:tab w:val="left" w:pos="7584"/>
+              </w:tabs>
+              <w:jc w:val="center"/>
+              <w:rPr>
+                <w:b/>
+                <w:sz w:val="28"/>
+                <w:szCs w:val="28"/>
+              </w:rPr>
+            </w:pPr>
+            <w:r>
+              <w:rPr>
+                <w:b/>
+                <w:sz w:val="28"/>
+                <w:szCs w:val="28"/>
+              </w:rPr>
+              <w:t>Fluxo Exceção</w:t>
+            </w:r>
+          </w:p>
+        </w:tc>
+      </w:tr>
+      <w:tr>
+        <w:trPr>
+          <w:trHeight w:val="1236"/>
+        </w:trPr>
+        <w:tc>
+          <w:tcPr>
+            <w:tcW w:w="10330" w:type="dxa"/>
+            <w:gridSpan w:val="2"/>
+            <w:tcBorders>
+              <w:top w:val="single" w:sz="4" w:space="0" w:color="000000"/>
+              <w:left w:val="single" w:sz="4" w:space="0" w:color="000000"/>
+              <w:bottom w:val="single" w:sz="4" w:space="0" w:color="000000"/>
+              <w:right w:val="single" w:sz="4" w:space="0" w:color="000000"/>
+            </w:tcBorders>
+          </w:tcPr>
+          <w:p>
+            <w:pPr>
+              <w:tabs>
+                <w:tab w:val="left" w:pos="3624"/>
+              </w:tabs>
+              <w:rPr>
+                <w:b/>
+                <w:sz w:val="28"/>
+                <w:szCs w:val="28"/>
+              </w:rPr>
+            </w:pPr>
+            <w:r>
+              <w:rPr>
+                <w:b/>
+                <w:sz w:val="28"/>
+                <w:szCs w:val="28"/>
+              </w:rPr>
+              <w:lastRenderedPageBreak/>
+              <w:tab/>
+            </w:r>
+          </w:p>
+          <w:p>
+            <w:r>
+              <w:rPr>
+                <w:b/>
+                <w:sz w:val="28"/>
+                <w:szCs w:val="28"/>
+              </w:rPr>
+              <w:t xml:space="preserve">Linha 6: </w:t>
+            </w:r>
+            <w:r>
+              <w:rPr>
+                <w:bCs/>
+                <w:sz w:val="28"/>
+                <w:szCs w:val="28"/>
+              </w:rPr>
+              <w:t xml:space="preserve">Ocorre uma falha durante a </w:t>
+            </w:r>
+            <w:r>
+              <w:rPr>
+                <w:bCs/>
+                <w:sz w:val="28"/>
+                <w:szCs w:val="28"/>
+              </w:rPr>
+              <w:t>inclusão</w:t>
+            </w:r>
+            <w:r>
+              <w:rPr>
+                <w:bCs/>
+                <w:sz w:val="28"/>
+                <w:szCs w:val="28"/>
+              </w:rPr>
+              <w:t xml:space="preserve"> dos dados do cliente, exibindo a mensagem “Não foi possível </w:t>
+            </w:r>
+            <w:r>
+              <w:rPr>
+                <w:bCs/>
+                <w:sz w:val="28"/>
+                <w:szCs w:val="28"/>
+              </w:rPr>
+              <w:t>cadastrar</w:t>
+            </w:r>
+            <w:r>
+              <w:rPr>
+                <w:bCs/>
+                <w:sz w:val="28"/>
+                <w:szCs w:val="28"/>
+              </w:rPr>
+              <w:t xml:space="preserve"> o </w:t>
+            </w:r>
+            <w:r>
+              <w:rPr>
+                <w:bCs/>
+                <w:sz w:val="28"/>
+                <w:szCs w:val="28"/>
+              </w:rPr>
+              <w:t>restaurante</w:t>
+            </w:r>
+            <w:r>
+              <w:rPr>
+                <w:bCs/>
+                <w:sz w:val="28"/>
+                <w:szCs w:val="28"/>
+              </w:rPr>
+              <w:t xml:space="preserve">, tente novamente!”. Retornando para tela </w:t>
+            </w:r>
+            <w:r>
+              <w:rPr>
+                <w:sz w:val="28"/>
+                <w:szCs w:val="28"/>
+              </w:rPr>
+              <w:t>(</w:t>
+            </w:r>
+            <w:r>
+              <w:rPr>
+                <w:color w:val="FF0000"/>
+                <w:sz w:val="28"/>
+                <w:szCs w:val="28"/>
+              </w:rPr>
+              <w:t>Tela_W2</w:t>
+            </w:r>
+            <w:r>
+              <w:rPr>
+                <w:color w:val="FF0000"/>
+                <w:sz w:val="28"/>
+                <w:szCs w:val="28"/>
+              </w:rPr>
+              <w:t>0</w:t>
+            </w:r>
+            <w:r>
+              <w:rPr>
+                <w:sz w:val="28"/>
+                <w:szCs w:val="28"/>
+              </w:rPr>
+              <w:t>).</w:t>
+            </w:r>
+          </w:p>
+          <w:p/>
+          <w:p>
+            <w:pPr>
+              <w:tabs>
+                <w:tab w:val="left" w:pos="3624"/>
+              </w:tabs>
+              <w:rPr>
+                <w:b/>
+                <w:sz w:val="28"/>
+                <w:szCs w:val="28"/>
+              </w:rPr>
+            </w:pPr>
+          </w:p>
+        </w:tc>
+      </w:tr>
+    </w:tbl>
     <w:p/>
     <w:p/>
     <w:tbl>
@@ -946,7 +2542,6 @@
               <w:bottom w:val="single" w:sz="4" w:space="0" w:color="000000"/>
               <w:right w:val="single" w:sz="4" w:space="0" w:color="000000"/>
             </w:tcBorders>
-            <w:shd w:val="clear" w:color="auto" w:fill="auto"/>
           </w:tcPr>
           <w:p>
             <w:pPr>
@@ -973,7 +2568,6 @@
               <w:bottom w:val="single" w:sz="4" w:space="0" w:color="000000"/>
               <w:right w:val="single" w:sz="4" w:space="0" w:color="000000"/>
             </w:tcBorders>
-            <w:shd w:val="clear" w:color="auto" w:fill="auto"/>
           </w:tcPr>
           <w:p>
             <w:pPr>
@@ -993,7 +2587,6 @@
               <w:bottom w:val="single" w:sz="4" w:space="0" w:color="000000"/>
               <w:right w:val="single" w:sz="4" w:space="0" w:color="000000"/>
             </w:tcBorders>
-            <w:shd w:val="clear" w:color="auto" w:fill="auto"/>
           </w:tcPr>
           <w:p>
             <w:pPr>
@@ -1013,7 +2606,6 @@
               <w:bottom w:val="single" w:sz="4" w:space="0" w:color="000000"/>
               <w:right w:val="single" w:sz="4" w:space="0" w:color="000000"/>
             </w:tcBorders>
-            <w:shd w:val="clear" w:color="auto" w:fill="auto"/>
           </w:tcPr>
           <w:p>
             <w:pPr>
@@ -1035,23 +2627,13 @@
               <w:bottom w:val="single" w:sz="4" w:space="0" w:color="000000"/>
               <w:right w:val="single" w:sz="4" w:space="0" w:color="000000"/>
             </w:tcBorders>
-            <w:shd w:val="clear" w:color="auto" w:fill="auto"/>
           </w:tcPr>
           <w:p>
             <w:pPr>
               <w:jc w:val="center"/>
             </w:pPr>
             <w:r>
-              <w:t>01</w:t>
-            </w:r>
-            <w:r>
-              <w:t>/0</w:t>
-            </w:r>
-            <w:r>
-              <w:t>9</w:t>
-            </w:r>
-            <w:r>
-              <w:t>/2025</w:t>
+              <w:t>01/09/2025</w:t>
             </w:r>
           </w:p>
         </w:tc>
@@ -1064,7 +2646,6 @@
               <w:bottom w:val="single" w:sz="4" w:space="0" w:color="000000"/>
               <w:right w:val="single" w:sz="4" w:space="0" w:color="000000"/>
             </w:tcBorders>
-            <w:shd w:val="clear" w:color="auto" w:fill="auto"/>
           </w:tcPr>
           <w:p>
             <w:pPr>
@@ -1084,7 +2665,6 @@
               <w:bottom w:val="single" w:sz="4" w:space="0" w:color="000000"/>
               <w:right w:val="single" w:sz="4" w:space="0" w:color="000000"/>
             </w:tcBorders>
-            <w:shd w:val="clear" w:color="auto" w:fill="auto"/>
           </w:tcPr>
           <w:p>
             <w:pPr>
@@ -1111,7 +2691,6 @@
               <w:bottom w:val="single" w:sz="4" w:space="0" w:color="000000"/>
               <w:right w:val="single" w:sz="4" w:space="0" w:color="000000"/>
             </w:tcBorders>
-            <w:shd w:val="clear" w:color="auto" w:fill="auto"/>
           </w:tcPr>
           <w:p>
             <w:pPr>
@@ -1131,7 +2710,6 @@
               <w:bottom w:val="single" w:sz="4" w:space="0" w:color="000000"/>
               <w:right w:val="single" w:sz="4" w:space="0" w:color="000000"/>
             </w:tcBorders>
-            <w:shd w:val="clear" w:color="auto" w:fill="auto"/>
           </w:tcPr>
           <w:p>
             <w:pPr>
@@ -1151,7 +2729,6 @@
               <w:bottom w:val="single" w:sz="4" w:space="0" w:color="000000"/>
               <w:right w:val="single" w:sz="4" w:space="0" w:color="000000"/>
             </w:tcBorders>
-            <w:shd w:val="clear" w:color="auto" w:fill="auto"/>
           </w:tcPr>
           <w:p>
             <w:pPr>
@@ -1173,7 +2750,6 @@
               <w:bottom w:val="single" w:sz="4" w:space="0" w:color="000000"/>
               <w:right w:val="single" w:sz="4" w:space="0" w:color="000000"/>
             </w:tcBorders>
-            <w:shd w:val="clear" w:color="auto" w:fill="auto"/>
           </w:tcPr>
           <w:p>
             <w:pPr>
@@ -1193,7 +2769,6 @@
               <w:bottom w:val="single" w:sz="4" w:space="0" w:color="000000"/>
               <w:right w:val="single" w:sz="4" w:space="0" w:color="000000"/>
             </w:tcBorders>
-            <w:shd w:val="clear" w:color="auto" w:fill="auto"/>
           </w:tcPr>
           <w:p>
             <w:pPr>
@@ -1213,7 +2788,6 @@
               <w:bottom w:val="single" w:sz="4" w:space="0" w:color="000000"/>
               <w:right w:val="single" w:sz="4" w:space="0" w:color="000000"/>
             </w:tcBorders>
-            <w:shd w:val="clear" w:color="auto" w:fill="auto"/>
           </w:tcPr>
           <w:p>
             <w:pPr>
@@ -1222,8 +2796,65 @@
             <w:r>
               <w:t>Adição de Fluxo de Exceção</w:t>
             </w:r>
-            <w:bookmarkStart w:id="2" w:name="_GoBack"/>
-            <w:bookmarkEnd w:id="2"/>
+          </w:p>
+        </w:tc>
+      </w:tr>
+      <w:tr>
+        <w:tc>
+          <w:tcPr>
+            <w:tcW w:w="2628" w:type="dxa"/>
+            <w:tcBorders>
+              <w:top w:val="single" w:sz="4" w:space="0" w:color="000000"/>
+              <w:left w:val="single" w:sz="4" w:space="0" w:color="000000"/>
+              <w:bottom w:val="single" w:sz="4" w:space="0" w:color="000000"/>
+              <w:right w:val="single" w:sz="4" w:space="0" w:color="000000"/>
+            </w:tcBorders>
+          </w:tcPr>
+          <w:p>
+            <w:pPr>
+              <w:jc w:val="center"/>
+            </w:pPr>
+            <w:r>
+              <w:t>07/11/2025</w:t>
+            </w:r>
+          </w:p>
+        </w:tc>
+        <w:tc>
+          <w:tcPr>
+            <w:tcW w:w="1800" w:type="dxa"/>
+            <w:tcBorders>
+              <w:top w:val="single" w:sz="4" w:space="0" w:color="000000"/>
+              <w:left w:val="single" w:sz="4" w:space="0" w:color="000000"/>
+              <w:bottom w:val="single" w:sz="4" w:space="0" w:color="000000"/>
+              <w:right w:val="single" w:sz="4" w:space="0" w:color="000000"/>
+            </w:tcBorders>
+          </w:tcPr>
+          <w:p>
+            <w:pPr>
+              <w:jc w:val="center"/>
+            </w:pPr>
+            <w:r>
+              <w:t>Paulo Henrique</w:t>
+            </w:r>
+          </w:p>
+        </w:tc>
+        <w:tc>
+          <w:tcPr>
+            <w:tcW w:w="6120" w:type="dxa"/>
+            <w:tcBorders>
+              <w:top w:val="single" w:sz="4" w:space="0" w:color="000000"/>
+              <w:left w:val="single" w:sz="4" w:space="0" w:color="000000"/>
+              <w:bottom w:val="single" w:sz="4" w:space="0" w:color="000000"/>
+              <w:right w:val="single" w:sz="4" w:space="0" w:color="000000"/>
+            </w:tcBorders>
+          </w:tcPr>
+          <w:p>
+            <w:pPr>
+              <w:jc w:val="center"/>
+            </w:pPr>
+            <w:r>
+              <w:t>Correção dos Fluxos</w:t>
+            </w:r>
           </w:p>
         </w:tc>
       </w:tr>
@@ -1240,8 +2871,188 @@
 </file>
 
 <file path=word/numbering.xml><?xml version="1.0" encoding="utf-8"?>
-<w:numbering xmlns:wpc="http://schemas.microsoft.com/office/word/2010/wordprocessingCanvas" xmlns:cx="http://schemas.microsoft.com/office/drawing/2014/chartex" xmlns:cx1="http://schemas.microsoft.com/office/drawing/2015/9/8/chartex" xmlns:cx2="http://schemas.microsoft.com/office/drawing/2015/10/21/chartex" xmlns:cx3="http://schemas.microsoft.com/office/drawing/2016/5/9/chartex" xmlns:cx4="http://schemas.microsoft.com/office/drawing/2016/5/10/chartex" xmlns:cx5="http://schemas.microsoft.com/office/drawing/2016/5/11/chartex" xmlns:cx6="http://schemas.microsoft.com/office/drawing/2016/5/12/chartex" xmlns:cx7="http://schemas.microsoft.com/office/drawing/2016/5/13/chartex" xmlns:cx8="http://schemas.microsoft.com/office/drawing/2016/5/14/chartex" xmlns:mc="http://schemas.openxmlformats.org/markup-compatibility/2006" xmlns:aink="http://schemas.microsoft.com/office/drawing/2016/ink" xmlns:am3d="http://schemas.microsoft.com/office/drawing/2017/model3d" xmlns:o="urn:schemas-microsoft-com:office:office" xmlns:r="http://schemas.openxmlformats.org/officeDocument/2006/relationships" xmlns:m="http://schemas.openxmlformats.org/officeDocument/2006/math" xmlns:v="urn:schemas-microsoft-com:vml" xmlns:wp14="http://schemas.microsoft.com/office/word/2010/wordprocessingDrawing" xmlns:wp="http://schemas.openxmlformats.org/drawingml/2006/wordprocessingDrawing" xmlns:w10="urn:schemas-microsoft-com:office:word" xmlns:w="http://schemas.openxmlformats.org/wordprocessingml/2006/main" xmlns:w14="http://schemas.microsoft.com/office/word/2010/wordml" xmlns:w15="http://schemas.microsoft.com/office/word/2012/wordml" xmlns:w16cex="http://schemas.microsoft.com/office/word/2018/wordml/cex" xmlns:w16cid="http://schemas.microsoft.com/office/word/2016/wordml/cid" xmlns:w16="http://schemas.microsoft.com/office/word/2018/wordml" xmlns:w16se="http://schemas.microsoft.com/office/word/2015/wordml/symex" xmlns:wpg="http://schemas.microsoft.com/office/word/2010/wordprocessingGroup" xmlns:wpi="http://schemas.microsoft.com/office/word/2010/wordprocessingInk" xmlns:wne="http://schemas.microsoft.com/office/word/2006/wordml" xmlns:wps="http://schemas.microsoft.com/office/word/2010/wordprocessingShape" mc:Ignorable="w14 w15 w16se w16cid w16 w16cex wp14">
+<w:numbering xmlns:wpc="http://schemas.microsoft.com/office/word/2010/wordprocessingCanvas" xmlns:cx="http://schemas.microsoft.com/office/drawing/2014/chartex" xmlns:cx1="http://schemas.microsoft.com/office/drawing/2015/9/8/chartex" xmlns:cx2="http://schemas.microsoft.com/office/drawing/2015/10/21/chartex" xmlns:cx3="http://schemas.microsoft.com/office/drawing/2016/5/9/chartex" xmlns:cx4="http://schemas.microsoft.com/office/drawing/2016/5/10/chartex" xmlns:cx5="http://schemas.microsoft.com/office/drawing/2016/5/11/chartex" xmlns:cx6="http://schemas.microsoft.com/office/drawing/2016/5/12/chartex" xmlns:cx7="http://schemas.microsoft.com/office/drawing/2016/5/13/chartex" xmlns:cx8="http://schemas.microsoft.com/office/drawing/2016/5/14/chartex" xmlns:mc="http://schemas.openxmlformats.org/markup-compatibility/2006" xmlns:aink="http://schemas.microsoft.com/office/drawing/2016/ink" xmlns:am3d="http://schemas.microsoft.com/office/drawing/2017/model3d" xmlns:o="urn:schemas-microsoft-com:office:office" xmlns:oel="http://schemas.microsoft.com/office/2019/extlst" xmlns:r="http://schemas.openxmlformats.org/officeDocument/2006/relationships" xmlns:m="http://schemas.openxmlformats.org/officeDocument/2006/math" xmlns:v="urn:schemas-microsoft-com:vml" xmlns:wp14="http://schemas.microsoft.com/office/word/2010/wordprocessingDrawing" xmlns:wp="http://schemas.openxmlformats.org/drawingml/2006/wordprocessingDrawing" xmlns:w10="urn:schemas-microsoft-com:office:word" xmlns:w="http://schemas.openxmlformats.org/wordprocessingml/2006/main" xmlns:w14="http://schemas.microsoft.com/office/word/2010/wordml" xmlns:w15="http://schemas.microsoft.com/office/word/2012/wordml" xmlns:w16cex="http://schemas.microsoft.com/office/word/2018/wordml/cex" xmlns:w16cid="http://schemas.microsoft.com/office/word/2016/wordml/cid" xmlns:w16="http://schemas.microsoft.com/office/word/2018/wordml" xmlns:w16du="http://schemas.microsoft.com/office/word/2023/wordml/word16du" xmlns:w16sdtdh="http://schemas.microsoft.com/office/word/2020/wordml/sdtdatahash" xmlns:w16sdtfl="http://schemas.microsoft.com/office/word/2024/wordml/sdtformatlock" xmlns:w16se="http://schemas.microsoft.com/office/word/2015/wordml/symex" xmlns:wpg="http://schemas.microsoft.com/office/word/2010/wordprocessingGroup" xmlns:wpi="http://schemas.microsoft.com/office/word/2010/wordprocessingInk" xmlns:wne="http://schemas.microsoft.com/office/word/2006/wordml" xmlns:wps="http://schemas.microsoft.com/office/word/2010/wordprocessingShape" mc:Ignorable="w14 w15 w16se w16cid w16 w16cex w16sdtdh w16sdtfl w16du wp14">
   <w:abstractNum w:abstractNumId="0" w15:restartNumberingAfterBreak="0">
+    <w:nsid w:val="02424476"/>
+    <w:multiLevelType w:val="hybridMultilevel"/>
+    <w:tmpl w:val="2B7EFE06"/>
+    <w:lvl w:ilvl="0" w:tplc="60249E68">
+      <w:start w:val="1"/>
+      <w:numFmt w:val="decimal"/>
+      <w:lvlText w:val="%1."/>
+      <w:lvlJc w:val="left"/>
+      <w:pPr>
+        <w:ind w:left="1440" w:hanging="360"/>
+      </w:pPr>
+      <w:rPr>
+        <w:b w:val="0"/>
+        <w:bCs/>
+      </w:rPr>
+    </w:lvl>
+    <w:lvl w:ilvl="1" w:tplc="04160019" w:tentative="1">
+      <w:start w:val="1"/>
+      <w:numFmt w:val="lowerLetter"/>
+      <w:lvlText w:val="%2."/>
+      <w:lvlJc w:val="left"/>
+      <w:pPr>
+        <w:ind w:left="1440" w:hanging="360"/>
+      </w:pPr>
+    </w:lvl>
+    <w:lvl w:ilvl="2" w:tplc="0416001B" w:tentative="1">
+      <w:start w:val="1"/>
+      <w:numFmt w:val="lowerRoman"/>
+      <w:lvlText w:val="%3."/>
+      <w:lvlJc w:val="right"/>
+      <w:pPr>
+        <w:ind w:left="2160" w:hanging="180"/>
+      </w:pPr>
+    </w:lvl>
+    <w:lvl w:ilvl="3" w:tplc="0416000F" w:tentative="1">
+      <w:start w:val="1"/>
+      <w:numFmt w:val="decimal"/>
+      <w:lvlText w:val="%4."/>
+      <w:lvlJc w:val="left"/>
+      <w:pPr>
+        <w:ind w:left="2880" w:hanging="360"/>
+      </w:pPr>
+    </w:lvl>
+    <w:lvl w:ilvl="4" w:tplc="04160019" w:tentative="1">
+      <w:start w:val="1"/>
+      <w:numFmt w:val="lowerLetter"/>
+      <w:lvlText w:val="%5."/>
+      <w:lvlJc w:val="left"/>
+      <w:pPr>
+        <w:ind w:left="3600" w:hanging="360"/>
+      </w:pPr>
+    </w:lvl>
+    <w:lvl w:ilvl="5" w:tplc="0416001B" w:tentative="1">
+      <w:start w:val="1"/>
+      <w:numFmt w:val="lowerRoman"/>
+      <w:lvlText w:val="%6."/>
+      <w:lvlJc w:val="right"/>
+      <w:pPr>
+        <w:ind w:left="4320" w:hanging="180"/>
+      </w:pPr>
+    </w:lvl>
+    <w:lvl w:ilvl="6" w:tplc="0416000F" w:tentative="1">
+      <w:start w:val="1"/>
+      <w:numFmt w:val="decimal"/>
+      <w:lvlText w:val="%7."/>
+      <w:lvlJc w:val="left"/>
+      <w:pPr>
+        <w:ind w:left="5040" w:hanging="360"/>
+      </w:pPr>
+    </w:lvl>
+    <w:lvl w:ilvl="7" w:tplc="04160019" w:tentative="1">
+      <w:start w:val="1"/>
+      <w:numFmt w:val="lowerLetter"/>
+      <w:lvlText w:val="%8."/>
+      <w:lvlJc w:val="left"/>
+      <w:pPr>
+        <w:ind w:left="5760" w:hanging="360"/>
+      </w:pPr>
+    </w:lvl>
+    <w:lvl w:ilvl="8" w:tplc="0416001B" w:tentative="1">
+      <w:start w:val="1"/>
+      <w:numFmt w:val="lowerRoman"/>
+      <w:lvlText w:val="%9."/>
+      <w:lvlJc w:val="right"/>
+      <w:pPr>
+        <w:ind w:left="6480" w:hanging="180"/>
+      </w:pPr>
+    </w:lvl>
+  </w:abstractNum>
+  <w:abstractNum w:abstractNumId="1" w15:restartNumberingAfterBreak="0">
+    <w:nsid w:val="08334DD0"/>
+    <w:multiLevelType w:val="hybridMultilevel"/>
+    <w:tmpl w:val="965CAB96"/>
+    <w:lvl w:ilvl="0" w:tplc="F3908122">
+      <w:start w:val="1"/>
+      <w:numFmt w:val="lowerLetter"/>
+      <w:lvlText w:val="%1)"/>
+      <w:lvlJc w:val="left"/>
+      <w:pPr>
+        <w:ind w:left="720" w:hanging="360"/>
+      </w:pPr>
+      <w:rPr>
+        <w:rFonts w:hint="default"/>
+        <w:color w:val="000000"/>
+      </w:rPr>
+    </w:lvl>
+    <w:lvl w:ilvl="1" w:tplc="04160019" w:tentative="1">
+      <w:start w:val="1"/>
+      <w:numFmt w:val="lowerLetter"/>
+      <w:lvlText w:val="%2."/>
+      <w:lvlJc w:val="left"/>
+      <w:pPr>
+        <w:ind w:left="1440" w:hanging="360"/>
+      </w:pPr>
+    </w:lvl>
+    <w:lvl w:ilvl="2" w:tplc="0416001B" w:tentative="1">
+      <w:start w:val="1"/>
+      <w:numFmt w:val="lowerRoman"/>
+      <w:lvlText w:val="%3."/>
+      <w:lvlJc w:val="right"/>
+      <w:pPr>
+        <w:ind w:left="2160" w:hanging="180"/>
+      </w:pPr>
+    </w:lvl>
+    <w:lvl w:ilvl="3" w:tplc="0416000F" w:tentative="1">
+      <w:start w:val="1"/>
+      <w:numFmt w:val="decimal"/>
+      <w:lvlText w:val="%4."/>
+      <w:lvlJc w:val="left"/>
+      <w:pPr>
+        <w:ind w:left="2880" w:hanging="360"/>
+      </w:pPr>
+    </w:lvl>
+    <w:lvl w:ilvl="4" w:tplc="04160019" w:tentative="1">
+      <w:start w:val="1"/>
+      <w:numFmt w:val="lowerLetter"/>
+      <w:lvlText w:val="%5."/>
+      <w:lvlJc w:val="left"/>
+      <w:pPr>
+        <w:ind w:left="3600" w:hanging="360"/>
+      </w:pPr>
+    </w:lvl>
+    <w:lvl w:ilvl="5" w:tplc="0416001B" w:tentative="1">
+      <w:start w:val="1"/>
+      <w:numFmt w:val="lowerRoman"/>
+      <w:lvlText w:val="%6."/>
+      <w:lvlJc w:val="right"/>
+      <w:pPr>
+        <w:ind w:left="4320" w:hanging="180"/>
+      </w:pPr>
+    </w:lvl>
+    <w:lvl w:ilvl="6" w:tplc="0416000F" w:tentative="1">
+      <w:start w:val="1"/>
+      <w:numFmt w:val="decimal"/>
+      <w:lvlText w:val="%7."/>
+      <w:lvlJc w:val="left"/>
+      <w:pPr>
+        <w:ind w:left="5040" w:hanging="360"/>
+      </w:pPr>
+    </w:lvl>
+    <w:lvl w:ilvl="7" w:tplc="04160019" w:tentative="1">
+      <w:start w:val="1"/>
+      <w:numFmt w:val="lowerLetter"/>
+      <w:lvlText w:val="%8."/>
+      <w:lvlJc w:val="left"/>
+      <w:pPr>
+        <w:ind w:left="5760" w:hanging="360"/>
+      </w:pPr>
+    </w:lvl>
+    <w:lvl w:ilvl="8" w:tplc="0416001B" w:tentative="1">
+      <w:start w:val="1"/>
+      <w:numFmt w:val="lowerRoman"/>
+      <w:lvlText w:val="%9."/>
+      <w:lvlJc w:val="right"/>
+      <w:pPr>
+        <w:ind w:left="6480" w:hanging="180"/>
+      </w:pPr>
+    </w:lvl>
+  </w:abstractNum>
+  <w:abstractNum w:abstractNumId="2" w15:restartNumberingAfterBreak="0">
     <w:nsid w:val="15435F1F"/>
     <w:multiLevelType w:val="multilevel"/>
     <w:tmpl w:val="D76A81C8"/>
@@ -1354,14 +3165,809 @@
       </w:rPr>
     </w:lvl>
   </w:abstractNum>
-  <w:num w:numId="1">
+  <w:abstractNum w:abstractNumId="3" w15:restartNumberingAfterBreak="0">
+    <w:nsid w:val="20483332"/>
+    <w:multiLevelType w:val="hybridMultilevel"/>
+    <w:tmpl w:val="6C80EBAA"/>
+    <w:lvl w:ilvl="0" w:tplc="0416000F">
+      <w:start w:val="1"/>
+      <w:numFmt w:val="decimal"/>
+      <w:lvlText w:val="%1."/>
+      <w:lvlJc w:val="left"/>
+      <w:pPr>
+        <w:ind w:left="720" w:hanging="360"/>
+      </w:pPr>
+    </w:lvl>
+    <w:lvl w:ilvl="1" w:tplc="04160019" w:tentative="1">
+      <w:start w:val="1"/>
+      <w:numFmt w:val="lowerLetter"/>
+      <w:lvlText w:val="%2."/>
+      <w:lvlJc w:val="left"/>
+      <w:pPr>
+        <w:ind w:left="1440" w:hanging="360"/>
+      </w:pPr>
+    </w:lvl>
+    <w:lvl w:ilvl="2" w:tplc="0416001B" w:tentative="1">
+      <w:start w:val="1"/>
+      <w:numFmt w:val="lowerRoman"/>
+      <w:lvlText w:val="%3."/>
+      <w:lvlJc w:val="right"/>
+      <w:pPr>
+        <w:ind w:left="2160" w:hanging="180"/>
+      </w:pPr>
+    </w:lvl>
+    <w:lvl w:ilvl="3" w:tplc="0416000F" w:tentative="1">
+      <w:start w:val="1"/>
+      <w:numFmt w:val="decimal"/>
+      <w:lvlText w:val="%4."/>
+      <w:lvlJc w:val="left"/>
+      <w:pPr>
+        <w:ind w:left="2880" w:hanging="360"/>
+      </w:pPr>
+    </w:lvl>
+    <w:lvl w:ilvl="4" w:tplc="04160019" w:tentative="1">
+      <w:start w:val="1"/>
+      <w:numFmt w:val="lowerLetter"/>
+      <w:lvlText w:val="%5."/>
+      <w:lvlJc w:val="left"/>
+      <w:pPr>
+        <w:ind w:left="3600" w:hanging="360"/>
+      </w:pPr>
+    </w:lvl>
+    <w:lvl w:ilvl="5" w:tplc="0416001B" w:tentative="1">
+      <w:start w:val="1"/>
+      <w:numFmt w:val="lowerRoman"/>
+      <w:lvlText w:val="%6."/>
+      <w:lvlJc w:val="right"/>
+      <w:pPr>
+        <w:ind w:left="4320" w:hanging="180"/>
+      </w:pPr>
+    </w:lvl>
+    <w:lvl w:ilvl="6" w:tplc="0416000F" w:tentative="1">
+      <w:start w:val="1"/>
+      <w:numFmt w:val="decimal"/>
+      <w:lvlText w:val="%7."/>
+      <w:lvlJc w:val="left"/>
+      <w:pPr>
+        <w:ind w:left="5040" w:hanging="360"/>
+      </w:pPr>
+    </w:lvl>
+    <w:lvl w:ilvl="7" w:tplc="04160019" w:tentative="1">
+      <w:start w:val="1"/>
+      <w:numFmt w:val="lowerLetter"/>
+      <w:lvlText w:val="%8."/>
+      <w:lvlJc w:val="left"/>
+      <w:pPr>
+        <w:ind w:left="5760" w:hanging="360"/>
+      </w:pPr>
+    </w:lvl>
+    <w:lvl w:ilvl="8" w:tplc="0416001B" w:tentative="1">
+      <w:start w:val="1"/>
+      <w:numFmt w:val="lowerRoman"/>
+      <w:lvlText w:val="%9."/>
+      <w:lvlJc w:val="right"/>
+      <w:pPr>
+        <w:ind w:left="6480" w:hanging="180"/>
+      </w:pPr>
+    </w:lvl>
+  </w:abstractNum>
+  <w:abstractNum w:abstractNumId="4" w15:restartNumberingAfterBreak="0">
+    <w:nsid w:val="32C319E4"/>
+    <w:multiLevelType w:val="hybridMultilevel"/>
+    <w:tmpl w:val="106C532A"/>
+    <w:lvl w:ilvl="0" w:tplc="F3908122">
+      <w:start w:val="1"/>
+      <w:numFmt w:val="lowerLetter"/>
+      <w:lvlText w:val="%1)"/>
+      <w:lvlJc w:val="left"/>
+      <w:pPr>
+        <w:ind w:left="720" w:hanging="360"/>
+      </w:pPr>
+      <w:rPr>
+        <w:rFonts w:hint="default"/>
+        <w:color w:val="000000"/>
+      </w:rPr>
+    </w:lvl>
+    <w:lvl w:ilvl="1" w:tplc="04160019" w:tentative="1">
+      <w:start w:val="1"/>
+      <w:numFmt w:val="lowerLetter"/>
+      <w:lvlText w:val="%2."/>
+      <w:lvlJc w:val="left"/>
+      <w:pPr>
+        <w:ind w:left="1440" w:hanging="360"/>
+      </w:pPr>
+    </w:lvl>
+    <w:lvl w:ilvl="2" w:tplc="0416001B" w:tentative="1">
+      <w:start w:val="1"/>
+      <w:numFmt w:val="lowerRoman"/>
+      <w:lvlText w:val="%3."/>
+      <w:lvlJc w:val="right"/>
+      <w:pPr>
+        <w:ind w:left="2160" w:hanging="180"/>
+      </w:pPr>
+    </w:lvl>
+    <w:lvl w:ilvl="3" w:tplc="0416000F" w:tentative="1">
+      <w:start w:val="1"/>
+      <w:numFmt w:val="decimal"/>
+      <w:lvlText w:val="%4."/>
+      <w:lvlJc w:val="left"/>
+      <w:pPr>
+        <w:ind w:left="2880" w:hanging="360"/>
+      </w:pPr>
+    </w:lvl>
+    <w:lvl w:ilvl="4" w:tplc="04160019" w:tentative="1">
+      <w:start w:val="1"/>
+      <w:numFmt w:val="lowerLetter"/>
+      <w:lvlText w:val="%5."/>
+      <w:lvlJc w:val="left"/>
+      <w:pPr>
+        <w:ind w:left="3600" w:hanging="360"/>
+      </w:pPr>
+    </w:lvl>
+    <w:lvl w:ilvl="5" w:tplc="0416001B" w:tentative="1">
+      <w:start w:val="1"/>
+      <w:numFmt w:val="lowerRoman"/>
+      <w:lvlText w:val="%6."/>
+      <w:lvlJc w:val="right"/>
+      <w:pPr>
+        <w:ind w:left="4320" w:hanging="180"/>
+      </w:pPr>
+    </w:lvl>
+    <w:lvl w:ilvl="6" w:tplc="0416000F" w:tentative="1">
+      <w:start w:val="1"/>
+      <w:numFmt w:val="decimal"/>
+      <w:lvlText w:val="%7."/>
+      <w:lvlJc w:val="left"/>
+      <w:pPr>
+        <w:ind w:left="5040" w:hanging="360"/>
+      </w:pPr>
+    </w:lvl>
+    <w:lvl w:ilvl="7" w:tplc="04160019" w:tentative="1">
+      <w:start w:val="1"/>
+      <w:numFmt w:val="lowerLetter"/>
+      <w:lvlText w:val="%8."/>
+      <w:lvlJc w:val="left"/>
+      <w:pPr>
+        <w:ind w:left="5760" w:hanging="360"/>
+      </w:pPr>
+    </w:lvl>
+    <w:lvl w:ilvl="8" w:tplc="0416001B" w:tentative="1">
+      <w:start w:val="1"/>
+      <w:numFmt w:val="lowerRoman"/>
+      <w:lvlText w:val="%9."/>
+      <w:lvlJc w:val="right"/>
+      <w:pPr>
+        <w:ind w:left="6480" w:hanging="180"/>
+      </w:pPr>
+    </w:lvl>
+  </w:abstractNum>
+  <w:abstractNum w:abstractNumId="5" w15:restartNumberingAfterBreak="0">
+    <w:nsid w:val="35C2121C"/>
+    <w:multiLevelType w:val="multilevel"/>
+    <w:tmpl w:val="56962FDA"/>
+    <w:lvl w:ilvl="0">
+      <w:start w:val="1"/>
+      <w:numFmt w:val="decimal"/>
+      <w:lvlText w:val="%1."/>
+      <w:lvlJc w:val="left"/>
+      <w:pPr>
+        <w:tabs>
+          <w:tab w:val="num" w:pos="720"/>
+        </w:tabs>
+        <w:ind w:left="720" w:hanging="360"/>
+      </w:pPr>
+      <w:rPr>
+        <w:b w:val="0"/>
+        <w:bCs/>
+      </w:rPr>
+    </w:lvl>
+    <w:lvl w:ilvl="1" w:tentative="1">
+      <w:start w:val="1"/>
+      <w:numFmt w:val="decimal"/>
+      <w:lvlText w:val="%2."/>
+      <w:lvlJc w:val="left"/>
+      <w:pPr>
+        <w:tabs>
+          <w:tab w:val="num" w:pos="1440"/>
+        </w:tabs>
+        <w:ind w:left="1440" w:hanging="360"/>
+      </w:pPr>
+    </w:lvl>
+    <w:lvl w:ilvl="2" w:tentative="1">
+      <w:start w:val="1"/>
+      <w:numFmt w:val="decimal"/>
+      <w:lvlText w:val="%3."/>
+      <w:lvlJc w:val="left"/>
+      <w:pPr>
+        <w:tabs>
+          <w:tab w:val="num" w:pos="2160"/>
+        </w:tabs>
+        <w:ind w:left="2160" w:hanging="360"/>
+      </w:pPr>
+    </w:lvl>
+    <w:lvl w:ilvl="3" w:tentative="1">
+      <w:start w:val="1"/>
+      <w:numFmt w:val="decimal"/>
+      <w:lvlText w:val="%4."/>
+      <w:lvlJc w:val="left"/>
+      <w:pPr>
+        <w:tabs>
+          <w:tab w:val="num" w:pos="2880"/>
+        </w:tabs>
+        <w:ind w:left="2880" w:hanging="360"/>
+      </w:pPr>
+    </w:lvl>
+    <w:lvl w:ilvl="4" w:tentative="1">
+      <w:start w:val="1"/>
+      <w:numFmt w:val="decimal"/>
+      <w:lvlText w:val="%5."/>
+      <w:lvlJc w:val="left"/>
+      <w:pPr>
+        <w:tabs>
+          <w:tab w:val="num" w:pos="3600"/>
+        </w:tabs>
+        <w:ind w:left="3600" w:hanging="360"/>
+      </w:pPr>
+    </w:lvl>
+    <w:lvl w:ilvl="5" w:tentative="1">
+      <w:start w:val="1"/>
+      <w:numFmt w:val="decimal"/>
+      <w:lvlText w:val="%6."/>
+      <w:lvlJc w:val="left"/>
+      <w:pPr>
+        <w:tabs>
+          <w:tab w:val="num" w:pos="4320"/>
+        </w:tabs>
+        <w:ind w:left="4320" w:hanging="360"/>
+      </w:pPr>
+    </w:lvl>
+    <w:lvl w:ilvl="6" w:tentative="1">
+      <w:start w:val="1"/>
+      <w:numFmt w:val="decimal"/>
+      <w:lvlText w:val="%7."/>
+      <w:lvlJc w:val="left"/>
+      <w:pPr>
+        <w:tabs>
+          <w:tab w:val="num" w:pos="5040"/>
+        </w:tabs>
+        <w:ind w:left="5040" w:hanging="360"/>
+      </w:pPr>
+    </w:lvl>
+    <w:lvl w:ilvl="7" w:tentative="1">
+      <w:start w:val="1"/>
+      <w:numFmt w:val="decimal"/>
+      <w:lvlText w:val="%8."/>
+      <w:lvlJc w:val="left"/>
+      <w:pPr>
+        <w:tabs>
+          <w:tab w:val="num" w:pos="5760"/>
+        </w:tabs>
+        <w:ind w:left="5760" w:hanging="360"/>
+      </w:pPr>
+    </w:lvl>
+    <w:lvl w:ilvl="8" w:tentative="1">
+      <w:start w:val="1"/>
+      <w:numFmt w:val="decimal"/>
+      <w:lvlText w:val="%9."/>
+      <w:lvlJc w:val="left"/>
+      <w:pPr>
+        <w:tabs>
+          <w:tab w:val="num" w:pos="6480"/>
+        </w:tabs>
+        <w:ind w:left="6480" w:hanging="360"/>
+      </w:pPr>
+    </w:lvl>
+  </w:abstractNum>
+  <w:abstractNum w:abstractNumId="6" w15:restartNumberingAfterBreak="0">
+    <w:nsid w:val="37AE4472"/>
+    <w:multiLevelType w:val="hybridMultilevel"/>
+    <w:tmpl w:val="227A26D4"/>
+    <w:lvl w:ilvl="0" w:tplc="60249E68">
+      <w:start w:val="1"/>
+      <w:numFmt w:val="decimal"/>
+      <w:lvlText w:val="%1."/>
+      <w:lvlJc w:val="left"/>
+      <w:pPr>
+        <w:ind w:left="1440" w:hanging="360"/>
+      </w:pPr>
+      <w:rPr>
+        <w:b w:val="0"/>
+        <w:bCs/>
+      </w:rPr>
+    </w:lvl>
+    <w:lvl w:ilvl="1" w:tplc="04160019" w:tentative="1">
+      <w:start w:val="1"/>
+      <w:numFmt w:val="lowerLetter"/>
+      <w:lvlText w:val="%2."/>
+      <w:lvlJc w:val="left"/>
+      <w:pPr>
+        <w:ind w:left="1440" w:hanging="360"/>
+      </w:pPr>
+    </w:lvl>
+    <w:lvl w:ilvl="2" w:tplc="0416001B" w:tentative="1">
+      <w:start w:val="1"/>
+      <w:numFmt w:val="lowerRoman"/>
+      <w:lvlText w:val="%3."/>
+      <w:lvlJc w:val="right"/>
+      <w:pPr>
+        <w:ind w:left="2160" w:hanging="180"/>
+      </w:pPr>
+    </w:lvl>
+    <w:lvl w:ilvl="3" w:tplc="0416000F" w:tentative="1">
+      <w:start w:val="1"/>
+      <w:numFmt w:val="decimal"/>
+      <w:lvlText w:val="%4."/>
+      <w:lvlJc w:val="left"/>
+      <w:pPr>
+        <w:ind w:left="2880" w:hanging="360"/>
+      </w:pPr>
+    </w:lvl>
+    <w:lvl w:ilvl="4" w:tplc="04160019" w:tentative="1">
+      <w:start w:val="1"/>
+      <w:numFmt w:val="lowerLetter"/>
+      <w:lvlText w:val="%5."/>
+      <w:lvlJc w:val="left"/>
+      <w:pPr>
+        <w:ind w:left="3600" w:hanging="360"/>
+      </w:pPr>
+    </w:lvl>
+    <w:lvl w:ilvl="5" w:tplc="0416001B" w:tentative="1">
+      <w:start w:val="1"/>
+      <w:numFmt w:val="lowerRoman"/>
+      <w:lvlText w:val="%6."/>
+      <w:lvlJc w:val="right"/>
+      <w:pPr>
+        <w:ind w:left="4320" w:hanging="180"/>
+      </w:pPr>
+    </w:lvl>
+    <w:lvl w:ilvl="6" w:tplc="0416000F" w:tentative="1">
+      <w:start w:val="1"/>
+      <w:numFmt w:val="decimal"/>
+      <w:lvlText w:val="%7."/>
+      <w:lvlJc w:val="left"/>
+      <w:pPr>
+        <w:ind w:left="5040" w:hanging="360"/>
+      </w:pPr>
+    </w:lvl>
+    <w:lvl w:ilvl="7" w:tplc="04160019" w:tentative="1">
+      <w:start w:val="1"/>
+      <w:numFmt w:val="lowerLetter"/>
+      <w:lvlText w:val="%8."/>
+      <w:lvlJc w:val="left"/>
+      <w:pPr>
+        <w:ind w:left="5760" w:hanging="360"/>
+      </w:pPr>
+    </w:lvl>
+    <w:lvl w:ilvl="8" w:tplc="0416001B" w:tentative="1">
+      <w:start w:val="1"/>
+      <w:numFmt w:val="lowerRoman"/>
+      <w:lvlText w:val="%9."/>
+      <w:lvlJc w:val="right"/>
+      <w:pPr>
+        <w:ind w:left="6480" w:hanging="180"/>
+      </w:pPr>
+    </w:lvl>
+  </w:abstractNum>
+  <w:abstractNum w:abstractNumId="7" w15:restartNumberingAfterBreak="0">
+    <w:nsid w:val="398F6E87"/>
+    <w:multiLevelType w:val="hybridMultilevel"/>
+    <w:tmpl w:val="F5184FDE"/>
+    <w:lvl w:ilvl="0" w:tplc="0416000F">
+      <w:start w:val="1"/>
+      <w:numFmt w:val="decimal"/>
+      <w:lvlText w:val="%1."/>
+      <w:lvlJc w:val="left"/>
+      <w:pPr>
+        <w:ind w:left="720" w:hanging="360"/>
+      </w:pPr>
+      <w:rPr>
+        <w:rFonts w:hint="default"/>
+        <w:color w:val="000000"/>
+      </w:rPr>
+    </w:lvl>
+    <w:lvl w:ilvl="1" w:tplc="FFFFFFFF" w:tentative="1">
+      <w:start w:val="1"/>
+      <w:numFmt w:val="lowerLetter"/>
+      <w:lvlText w:val="%2."/>
+      <w:lvlJc w:val="left"/>
+      <w:pPr>
+        <w:ind w:left="1440" w:hanging="360"/>
+      </w:pPr>
+    </w:lvl>
+    <w:lvl w:ilvl="2" w:tplc="FFFFFFFF" w:tentative="1">
+      <w:start w:val="1"/>
+      <w:numFmt w:val="lowerRoman"/>
+      <w:lvlText w:val="%3."/>
+      <w:lvlJc w:val="right"/>
+      <w:pPr>
+        <w:ind w:left="2160" w:hanging="180"/>
+      </w:pPr>
+    </w:lvl>
+    <w:lvl w:ilvl="3" w:tplc="FFFFFFFF" w:tentative="1">
+      <w:start w:val="1"/>
+      <w:numFmt w:val="decimal"/>
+      <w:lvlText w:val="%4."/>
+      <w:lvlJc w:val="left"/>
+      <w:pPr>
+        <w:ind w:left="2880" w:hanging="360"/>
+      </w:pPr>
+    </w:lvl>
+    <w:lvl w:ilvl="4" w:tplc="FFFFFFFF" w:tentative="1">
+      <w:start w:val="1"/>
+      <w:numFmt w:val="lowerLetter"/>
+      <w:lvlText w:val="%5."/>
+      <w:lvlJc w:val="left"/>
+      <w:pPr>
+        <w:ind w:left="3600" w:hanging="360"/>
+      </w:pPr>
+    </w:lvl>
+    <w:lvl w:ilvl="5" w:tplc="FFFFFFFF" w:tentative="1">
+      <w:start w:val="1"/>
+      <w:numFmt w:val="lowerRoman"/>
+      <w:lvlText w:val="%6."/>
+      <w:lvlJc w:val="right"/>
+      <w:pPr>
+        <w:ind w:left="4320" w:hanging="180"/>
+      </w:pPr>
+    </w:lvl>
+    <w:lvl w:ilvl="6" w:tplc="FFFFFFFF" w:tentative="1">
+      <w:start w:val="1"/>
+      <w:numFmt w:val="decimal"/>
+      <w:lvlText w:val="%7."/>
+      <w:lvlJc w:val="left"/>
+      <w:pPr>
+        <w:ind w:left="5040" w:hanging="360"/>
+      </w:pPr>
+    </w:lvl>
+    <w:lvl w:ilvl="7" w:tplc="FFFFFFFF" w:tentative="1">
+      <w:start w:val="1"/>
+      <w:numFmt w:val="lowerLetter"/>
+      <w:lvlText w:val="%8."/>
+      <w:lvlJc w:val="left"/>
+      <w:pPr>
+        <w:ind w:left="5760" w:hanging="360"/>
+      </w:pPr>
+    </w:lvl>
+    <w:lvl w:ilvl="8" w:tplc="FFFFFFFF" w:tentative="1">
+      <w:start w:val="1"/>
+      <w:numFmt w:val="lowerRoman"/>
+      <w:lvlText w:val="%9."/>
+      <w:lvlJc w:val="right"/>
+      <w:pPr>
+        <w:ind w:left="6480" w:hanging="180"/>
+      </w:pPr>
+    </w:lvl>
+  </w:abstractNum>
+  <w:abstractNum w:abstractNumId="8" w15:restartNumberingAfterBreak="0">
+    <w:nsid w:val="417A3387"/>
+    <w:multiLevelType w:val="multilevel"/>
+    <w:tmpl w:val="EF8C65FC"/>
+    <w:lvl w:ilvl="0">
+      <w:start w:val="1"/>
+      <w:numFmt w:val="decimal"/>
+      <w:lvlText w:val=""/>
+      <w:lvlJc w:val="left"/>
+      <w:pPr>
+        <w:ind w:left="0" w:firstLine="0"/>
+      </w:pPr>
+      <w:rPr>
+        <w:vertAlign w:val="baseline"/>
+      </w:rPr>
+    </w:lvl>
+    <w:lvl w:ilvl="1">
+      <w:start w:val="1"/>
+      <w:numFmt w:val="decimal"/>
+      <w:lvlText w:val=""/>
+      <w:lvlJc w:val="left"/>
+      <w:pPr>
+        <w:ind w:left="0" w:firstLine="0"/>
+      </w:pPr>
+      <w:rPr>
+        <w:vertAlign w:val="baseline"/>
+      </w:rPr>
+    </w:lvl>
+    <w:lvl w:ilvl="2">
+      <w:start w:val="1"/>
+      <w:numFmt w:val="decimal"/>
+      <w:lvlText w:val=""/>
+      <w:lvlJc w:val="left"/>
+      <w:pPr>
+        <w:ind w:left="0" w:firstLine="0"/>
+      </w:pPr>
+      <w:rPr>
+        <w:vertAlign w:val="baseline"/>
+      </w:rPr>
+    </w:lvl>
+    <w:lvl w:ilvl="3">
+      <w:start w:val="1"/>
+      <w:numFmt w:val="decimal"/>
+      <w:lvlText w:val=""/>
+      <w:lvlJc w:val="left"/>
+      <w:pPr>
+        <w:ind w:left="0" w:firstLine="0"/>
+      </w:pPr>
+      <w:rPr>
+        <w:vertAlign w:val="baseline"/>
+      </w:rPr>
+    </w:lvl>
+    <w:lvl w:ilvl="4">
+      <w:start w:val="1"/>
+      <w:numFmt w:val="decimal"/>
+      <w:lvlText w:val=""/>
+      <w:lvlJc w:val="left"/>
+      <w:pPr>
+        <w:ind w:left="0" w:firstLine="0"/>
+      </w:pPr>
+      <w:rPr>
+        <w:vertAlign w:val="baseline"/>
+      </w:rPr>
+    </w:lvl>
+    <w:lvl w:ilvl="5">
+      <w:start w:val="1"/>
+      <w:numFmt w:val="decimal"/>
+      <w:lvlText w:val=""/>
+      <w:lvlJc w:val="left"/>
+      <w:pPr>
+        <w:ind w:left="0" w:firstLine="0"/>
+      </w:pPr>
+      <w:rPr>
+        <w:vertAlign w:val="baseline"/>
+      </w:rPr>
+    </w:lvl>
+    <w:lvl w:ilvl="6">
+      <w:start w:val="1"/>
+      <w:numFmt w:val="decimal"/>
+      <w:lvlText w:val=""/>
+      <w:lvlJc w:val="left"/>
+      <w:pPr>
+        <w:ind w:left="0" w:firstLine="0"/>
+      </w:pPr>
+      <w:rPr>
+        <w:vertAlign w:val="baseline"/>
+      </w:rPr>
+    </w:lvl>
+    <w:lvl w:ilvl="7">
+      <w:start w:val="1"/>
+      <w:numFmt w:val="decimal"/>
+      <w:lvlText w:val=""/>
+      <w:lvlJc w:val="left"/>
+      <w:pPr>
+        <w:ind w:left="0" w:firstLine="0"/>
+      </w:pPr>
+      <w:rPr>
+        <w:vertAlign w:val="baseline"/>
+      </w:rPr>
+    </w:lvl>
+    <w:lvl w:ilvl="8">
+      <w:start w:val="1"/>
+      <w:numFmt w:val="decimal"/>
+      <w:lvlText w:val=""/>
+      <w:lvlJc w:val="left"/>
+      <w:pPr>
+        <w:ind w:left="0" w:firstLine="0"/>
+      </w:pPr>
+      <w:rPr>
+        <w:vertAlign w:val="baseline"/>
+      </w:rPr>
+    </w:lvl>
+  </w:abstractNum>
+  <w:abstractNum w:abstractNumId="9" w15:restartNumberingAfterBreak="0">
+    <w:nsid w:val="671014FD"/>
+    <w:multiLevelType w:val="hybridMultilevel"/>
+    <w:tmpl w:val="E9A02CB4"/>
+    <w:lvl w:ilvl="0" w:tplc="60249E68">
+      <w:start w:val="1"/>
+      <w:numFmt w:val="decimal"/>
+      <w:lvlText w:val="%1."/>
+      <w:lvlJc w:val="left"/>
+      <w:pPr>
+        <w:ind w:left="1440" w:hanging="360"/>
+      </w:pPr>
+      <w:rPr>
+        <w:b w:val="0"/>
+        <w:bCs/>
+      </w:rPr>
+    </w:lvl>
+    <w:lvl w:ilvl="1" w:tplc="04160019" w:tentative="1">
+      <w:start w:val="1"/>
+      <w:numFmt w:val="lowerLetter"/>
+      <w:lvlText w:val="%2."/>
+      <w:lvlJc w:val="left"/>
+      <w:pPr>
+        <w:ind w:left="2160" w:hanging="360"/>
+      </w:pPr>
+    </w:lvl>
+    <w:lvl w:ilvl="2" w:tplc="0416001B" w:tentative="1">
+      <w:start w:val="1"/>
+      <w:numFmt w:val="lowerRoman"/>
+      <w:lvlText w:val="%3."/>
+      <w:lvlJc w:val="right"/>
+      <w:pPr>
+        <w:ind w:left="2880" w:hanging="180"/>
+      </w:pPr>
+    </w:lvl>
+    <w:lvl w:ilvl="3" w:tplc="0416000F" w:tentative="1">
+      <w:start w:val="1"/>
+      <w:numFmt w:val="decimal"/>
+      <w:lvlText w:val="%4."/>
+      <w:lvlJc w:val="left"/>
+      <w:pPr>
+        <w:ind w:left="3600" w:hanging="360"/>
+      </w:pPr>
+    </w:lvl>
+    <w:lvl w:ilvl="4" w:tplc="04160019" w:tentative="1">
+      <w:start w:val="1"/>
+      <w:numFmt w:val="lowerLetter"/>
+      <w:lvlText w:val="%5."/>
+      <w:lvlJc w:val="left"/>
+      <w:pPr>
+        <w:ind w:left="4320" w:hanging="360"/>
+      </w:pPr>
+    </w:lvl>
+    <w:lvl w:ilvl="5" w:tplc="0416001B" w:tentative="1">
+      <w:start w:val="1"/>
+      <w:numFmt w:val="lowerRoman"/>
+      <w:lvlText w:val="%6."/>
+      <w:lvlJc w:val="right"/>
+      <w:pPr>
+        <w:ind w:left="5040" w:hanging="180"/>
+      </w:pPr>
+    </w:lvl>
+    <w:lvl w:ilvl="6" w:tplc="0416000F" w:tentative="1">
+      <w:start w:val="1"/>
+      <w:numFmt w:val="decimal"/>
+      <w:lvlText w:val="%7."/>
+      <w:lvlJc w:val="left"/>
+      <w:pPr>
+        <w:ind w:left="5760" w:hanging="360"/>
+      </w:pPr>
+    </w:lvl>
+    <w:lvl w:ilvl="7" w:tplc="04160019" w:tentative="1">
+      <w:start w:val="1"/>
+      <w:numFmt w:val="lowerLetter"/>
+      <w:lvlText w:val="%8."/>
+      <w:lvlJc w:val="left"/>
+      <w:pPr>
+        <w:ind w:left="6480" w:hanging="360"/>
+      </w:pPr>
+    </w:lvl>
+    <w:lvl w:ilvl="8" w:tplc="0416001B" w:tentative="1">
+      <w:start w:val="1"/>
+      <w:numFmt w:val="lowerRoman"/>
+      <w:lvlText w:val="%9."/>
+      <w:lvlJc w:val="right"/>
+      <w:pPr>
+        <w:ind w:left="7200" w:hanging="180"/>
+      </w:pPr>
+    </w:lvl>
+  </w:abstractNum>
+  <w:abstractNum w:abstractNumId="10" w15:restartNumberingAfterBreak="0">
+    <w:nsid w:val="7B180CFC"/>
+    <w:multiLevelType w:val="multilevel"/>
+    <w:tmpl w:val="B3B4700C"/>
+    <w:lvl w:ilvl="0">
+      <w:start w:val="1"/>
+      <w:numFmt w:val="decimal"/>
+      <w:lvlText w:val="%1."/>
+      <w:lvlJc w:val="left"/>
+      <w:pPr>
+        <w:ind w:left="720" w:hanging="360"/>
+      </w:pPr>
+      <w:rPr>
+        <w:vertAlign w:val="baseline"/>
+      </w:rPr>
+    </w:lvl>
+    <w:lvl w:ilvl="1">
+      <w:start w:val="1"/>
+      <w:numFmt w:val="bullet"/>
+      <w:lvlText w:val=""/>
+      <w:lvlJc w:val="left"/>
+      <w:pPr>
+        <w:ind w:left="0" w:firstLine="0"/>
+      </w:pPr>
+    </w:lvl>
+    <w:lvl w:ilvl="2">
+      <w:start w:val="1"/>
+      <w:numFmt w:val="bullet"/>
+      <w:lvlText w:val=""/>
+      <w:lvlJc w:val="left"/>
+      <w:pPr>
+        <w:ind w:left="0" w:firstLine="0"/>
+      </w:pPr>
+    </w:lvl>
+    <w:lvl w:ilvl="3">
+      <w:start w:val="1"/>
+      <w:numFmt w:val="bullet"/>
+      <w:lvlText w:val=""/>
+      <w:lvlJc w:val="left"/>
+      <w:pPr>
+        <w:ind w:left="0" w:firstLine="0"/>
+      </w:pPr>
+    </w:lvl>
+    <w:lvl w:ilvl="4">
+      <w:start w:val="1"/>
+      <w:numFmt w:val="bullet"/>
+      <w:lvlText w:val=""/>
+      <w:lvlJc w:val="left"/>
+      <w:pPr>
+        <w:ind w:left="0" w:firstLine="0"/>
+      </w:pPr>
+    </w:lvl>
+    <w:lvl w:ilvl="5">
+      <w:start w:val="1"/>
+      <w:numFmt w:val="bullet"/>
+      <w:lvlText w:val=""/>
+      <w:lvlJc w:val="left"/>
+      <w:pPr>
+        <w:ind w:left="0" w:firstLine="0"/>
+      </w:pPr>
+    </w:lvl>
+    <w:lvl w:ilvl="6">
+      <w:start w:val="1"/>
+      <w:numFmt w:val="bullet"/>
+      <w:lvlText w:val=""/>
+      <w:lvlJc w:val="left"/>
+      <w:pPr>
+        <w:ind w:left="0" w:firstLine="0"/>
+      </w:pPr>
+    </w:lvl>
+    <w:lvl w:ilvl="7">
+      <w:start w:val="1"/>
+      <w:numFmt w:val="bullet"/>
+      <w:lvlText w:val=""/>
+      <w:lvlJc w:val="left"/>
+      <w:pPr>
+        <w:ind w:left="0" w:firstLine="0"/>
+      </w:pPr>
+    </w:lvl>
+    <w:lvl w:ilvl="8">
+      <w:start w:val="1"/>
+      <w:numFmt w:val="bullet"/>
+      <w:lvlText w:val=""/>
+      <w:lvlJc w:val="left"/>
+      <w:pPr>
+        <w:ind w:left="0" w:firstLine="0"/>
+      </w:pPr>
+    </w:lvl>
+  </w:abstractNum>
+  <w:num w:numId="1" w16cid:durableId="1019234856">
+    <w:abstractNumId w:val="2"/>
+  </w:num>
+  <w:num w:numId="2" w16cid:durableId="602342507">
+    <w:abstractNumId w:val="8"/>
+  </w:num>
+  <w:num w:numId="3" w16cid:durableId="27727796">
+    <w:abstractNumId w:val="10"/>
+  </w:num>
+  <w:num w:numId="4" w16cid:durableId="309023725">
+    <w:abstractNumId w:val="1"/>
+  </w:num>
+  <w:num w:numId="5" w16cid:durableId="194781403">
+    <w:abstractNumId w:val="4"/>
+  </w:num>
+  <w:num w:numId="6" w16cid:durableId="2137722720">
+    <w:abstractNumId w:val="7"/>
+  </w:num>
+  <w:num w:numId="7" w16cid:durableId="234777777">
+    <w:abstractNumId w:val="5"/>
+  </w:num>
+  <w:num w:numId="8" w16cid:durableId="536158066">
+    <w:abstractNumId w:val="3"/>
+  </w:num>
+  <w:num w:numId="9" w16cid:durableId="861357786">
+    <w:abstractNumId w:val="9"/>
+  </w:num>
+  <w:num w:numId="10" w16cid:durableId="1810047404">
     <w:abstractNumId w:val="0"/>
+  </w:num>
+  <w:num w:numId="11" w16cid:durableId="302463944">
+    <w:abstractNumId w:val="6"/>
   </w:num>
 </w:numbering>
 </file>
 
 <file path=word/styles.xml><?xml version="1.0" encoding="utf-8"?>
-<w:styles xmlns:mc="http://schemas.openxmlformats.org/markup-compatibility/2006" xmlns:r="http://schemas.openxmlformats.org/officeDocument/2006/relationships" xmlns:w="http://schemas.openxmlformats.org/wordprocessingml/2006/main" xmlns:w14="http://schemas.microsoft.com/office/word/2010/wordml" xmlns:w15="http://schemas.microsoft.com/office/word/2012/wordml" xmlns:w16cex="http://schemas.microsoft.com/office/word/2018/wordml/cex" xmlns:w16cid="http://schemas.microsoft.com/office/word/2016/wordml/cid" xmlns:w16="http://schemas.microsoft.com/office/word/2018/wordml" xmlns:w16se="http://schemas.microsoft.com/office/word/2015/wordml/symex" mc:Ignorable="w14 w15 w16se w16cid w16 w16cex">
+<w:styles xmlns:mc="http://schemas.openxmlformats.org/markup-compatibility/2006" xmlns:r="http://schemas.openxmlformats.org/officeDocument/2006/relationships" xmlns:w="http://schemas.openxmlformats.org/wordprocessingml/2006/main" xmlns:w14="http://schemas.microsoft.com/office/word/2010/wordml" xmlns:w15="http://schemas.microsoft.com/office/word/2012/wordml" xmlns:w16cex="http://schemas.microsoft.com/office/word/2018/wordml/cex" xmlns:w16cid="http://schemas.microsoft.com/office/word/2016/wordml/cid" xmlns:w16="http://schemas.microsoft.com/office/word/2018/wordml" xmlns:w16du="http://schemas.microsoft.com/office/word/2023/wordml/word16du" xmlns:w16sdtdh="http://schemas.microsoft.com/office/word/2020/wordml/sdtdatahash" xmlns:w16sdtfl="http://schemas.microsoft.com/office/word/2024/wordml/sdtformatlock" xmlns:w16se="http://schemas.microsoft.com/office/word/2015/wordml/symex" mc:Ignorable="w14 w15 w16se w16cid w16 w16cex w16sdtdh w16sdtfl w16du">
   <w:docDefaults>
     <w:rPrDefault>
       <w:rPr>
@@ -1869,7 +4475,6 @@
   <w:style w:type="character" w:default="1" w:styleId="Fontepargpadro">
     <w:name w:val="Default Paragraph Font"/>
     <w:uiPriority w:val="1"/>
-    <w:semiHidden/>
     <w:unhideWhenUsed/>
   </w:style>
   <w:style w:type="table" w:default="1" w:styleId="Tabelanormal">
@@ -2053,7 +4658,7 @@
     <w:basedOn w:val="Normal"/>
     <w:pPr>
       <w:spacing w:line="1" w:lineRule="atLeast"/>
-      <w:ind w:leftChars="-1" w:left="284" w:hangingChars="1"/>
+      <w:ind w:leftChars="-1" w:left="284" w:hangingChars="1" w:hanging="1"/>
       <w:textDirection w:val="btLr"/>
       <w:textAlignment w:val="top"/>
       <w:outlineLvl w:val="0"/>
@@ -2099,9 +4704,7 @@
       <w:tblStyleRowBandSize w:val="1"/>
       <w:tblStyleColBandSize w:val="1"/>
       <w:tblCellMar>
-        <w:top w:w="0" w:type="dxa"/>
         <w:left w:w="70" w:type="dxa"/>
-        <w:bottom w:w="0" w:type="dxa"/>
         <w:right w:w="70" w:type="dxa"/>
       </w:tblCellMar>
     </w:tblPr>
@@ -2112,9 +4715,7 @@
       <w:tblStyleRowBandSize w:val="1"/>
       <w:tblStyleColBandSize w:val="1"/>
       <w:tblCellMar>
-        <w:top w:w="0" w:type="dxa"/>
         <w:left w:w="70" w:type="dxa"/>
-        <w:bottom w:w="0" w:type="dxa"/>
         <w:right w:w="70" w:type="dxa"/>
       </w:tblCellMar>
     </w:tblPr>
@@ -2125,9 +4726,7 @@
       <w:tblStyleRowBandSize w:val="1"/>
       <w:tblStyleColBandSize w:val="1"/>
       <w:tblCellMar>
-        <w:top w:w="0" w:type="dxa"/>
         <w:left w:w="70" w:type="dxa"/>
-        <w:bottom w:w="0" w:type="dxa"/>
         <w:right w:w="70" w:type="dxa"/>
       </w:tblCellMar>
     </w:tblPr>
@@ -2138,9 +4737,7 @@
       <w:tblStyleRowBandSize w:val="1"/>
       <w:tblStyleColBandSize w:val="1"/>
       <w:tblCellMar>
-        <w:top w:w="0" w:type="dxa"/>
         <w:left w:w="70" w:type="dxa"/>
-        <w:bottom w:w="0" w:type="dxa"/>
         <w:right w:w="70" w:type="dxa"/>
       </w:tblCellMar>
     </w:tblPr>
@@ -2151,9 +4748,7 @@
       <w:tblStyleRowBandSize w:val="1"/>
       <w:tblStyleColBandSize w:val="1"/>
       <w:tblCellMar>
-        <w:top w:w="0" w:type="dxa"/>
         <w:left w:w="70" w:type="dxa"/>
-        <w:bottom w:w="0" w:type="dxa"/>
         <w:right w:w="70" w:type="dxa"/>
       </w:tblCellMar>
     </w:tblPr>
@@ -2164,9 +4759,7 @@
       <w:tblStyleRowBandSize w:val="1"/>
       <w:tblStyleColBandSize w:val="1"/>
       <w:tblCellMar>
-        <w:top w:w="0" w:type="dxa"/>
         <w:left w:w="108" w:type="dxa"/>
-        <w:bottom w:w="0" w:type="dxa"/>
         <w:right w:w="108" w:type="dxa"/>
       </w:tblCellMar>
     </w:tblPr>
@@ -2177,9 +4770,7 @@
       <w:tblStyleRowBandSize w:val="1"/>
       <w:tblStyleColBandSize w:val="1"/>
       <w:tblCellMar>
-        <w:top w:w="0" w:type="dxa"/>
         <w:left w:w="70" w:type="dxa"/>
-        <w:bottom w:w="0" w:type="dxa"/>
         <w:right w:w="70" w:type="dxa"/>
       </w:tblCellMar>
     </w:tblPr>
@@ -2190,9 +4781,7 @@
       <w:tblStyleRowBandSize w:val="1"/>
       <w:tblStyleColBandSize w:val="1"/>
       <w:tblCellMar>
-        <w:top w:w="0" w:type="dxa"/>
         <w:left w:w="70" w:type="dxa"/>
-        <w:bottom w:w="0" w:type="dxa"/>
         <w:right w:w="70" w:type="dxa"/>
       </w:tblCellMar>
     </w:tblPr>
@@ -2203,9 +4792,7 @@
       <w:tblStyleRowBandSize w:val="1"/>
       <w:tblStyleColBandSize w:val="1"/>
       <w:tblCellMar>
-        <w:top w:w="0" w:type="dxa"/>
         <w:left w:w="70" w:type="dxa"/>
-        <w:bottom w:w="0" w:type="dxa"/>
         <w:right w:w="70" w:type="dxa"/>
       </w:tblCellMar>
     </w:tblPr>
@@ -2216,9 +4803,7 @@
       <w:tblStyleRowBandSize w:val="1"/>
       <w:tblStyleColBandSize w:val="1"/>
       <w:tblCellMar>
-        <w:top w:w="0" w:type="dxa"/>
         <w:left w:w="108" w:type="dxa"/>
-        <w:bottom w:w="0" w:type="dxa"/>
         <w:right w:w="108" w:type="dxa"/>
       </w:tblCellMar>
     </w:tblPr>
@@ -2229,9 +4814,7 @@
       <w:tblStyleRowBandSize w:val="1"/>
       <w:tblStyleColBandSize w:val="1"/>
       <w:tblCellMar>
-        <w:top w:w="0" w:type="dxa"/>
         <w:left w:w="70" w:type="dxa"/>
-        <w:bottom w:w="0" w:type="dxa"/>
         <w:right w:w="70" w:type="dxa"/>
       </w:tblCellMar>
     </w:tblPr>
@@ -2242,9 +4825,7 @@
       <w:tblStyleRowBandSize w:val="1"/>
       <w:tblStyleColBandSize w:val="1"/>
       <w:tblCellMar>
-        <w:top w:w="0" w:type="dxa"/>
         <w:left w:w="70" w:type="dxa"/>
-        <w:bottom w:w="0" w:type="dxa"/>
         <w:right w:w="70" w:type="dxa"/>
       </w:tblCellMar>
     </w:tblPr>
@@ -2255,9 +4836,7 @@
       <w:tblStyleRowBandSize w:val="1"/>
       <w:tblStyleColBandSize w:val="1"/>
       <w:tblCellMar>
-        <w:top w:w="0" w:type="dxa"/>
         <w:left w:w="70" w:type="dxa"/>
-        <w:bottom w:w="0" w:type="dxa"/>
         <w:right w:w="70" w:type="dxa"/>
       </w:tblCellMar>
     </w:tblPr>
@@ -2268,9 +4847,7 @@
       <w:tblStyleRowBandSize w:val="1"/>
       <w:tblStyleColBandSize w:val="1"/>
       <w:tblCellMar>
-        <w:top w:w="0" w:type="dxa"/>
         <w:left w:w="108" w:type="dxa"/>
-        <w:bottom w:w="0" w:type="dxa"/>
         <w:right w:w="108" w:type="dxa"/>
       </w:tblCellMar>
     </w:tblPr>
@@ -2300,9 +4877,7 @@
       <w:tblStyleRowBandSize w:val="1"/>
       <w:tblStyleColBandSize w:val="1"/>
       <w:tblCellMar>
-        <w:top w:w="0" w:type="dxa"/>
         <w:left w:w="70" w:type="dxa"/>
-        <w:bottom w:w="0" w:type="dxa"/>
         <w:right w:w="70" w:type="dxa"/>
       </w:tblCellMar>
     </w:tblPr>
@@ -2313,12 +4888,21 @@
       <w:tblStyleRowBandSize w:val="1"/>
       <w:tblStyleColBandSize w:val="1"/>
       <w:tblCellMar>
-        <w:top w:w="0" w:type="dxa"/>
         <w:left w:w="108" w:type="dxa"/>
-        <w:bottom w:w="0" w:type="dxa"/>
         <w:right w:w="108" w:type="dxa"/>
       </w:tblCellMar>
     </w:tblPr>
+  </w:style>
+  <w:style w:type="paragraph" w:styleId="PargrafodaLista">
+    <w:name w:val="List Paragraph"/>
+    <w:basedOn w:val="Normal"/>
+    <w:uiPriority w:val="34"/>
+    <w:qFormat/>
+    <w:rsid w:val="00773EB7"/>
+    <w:pPr>
+      <w:ind w:left="720"/>
+      <w:contextualSpacing/>
+    </w:pPr>
   </w:style>
 </w:styles>
 </file>

</xml_diff>